<commit_message>
docs: update academic submission report and viva presentation guides with 24-cycle oscilloscope, interactive HUD gauges, and silicon X-ray
</commit_message>
<xml_diff>
--- a/OS_SUBMISSION_REPORT_NIKHIL_SAKSHI.docx
+++ b/OS_SUBMISSION_REPORT_NIKHIL_SAKSHI.docx
@@ -8,215 +8,52 @@
       </w:pPr>
       <w:r>
         <w:rPr>
-          <w:rFonts w:ascii="Calibri" w:hAnsi="Calibri"/>
           <w:b/>
-          <w:color w:val="2563EB"/>
-          <w:sz w:val="20"/>
+          <w:color w:val="0052FF"/>
+          <w:sz w:val="40"/>
         </w:rPr>
-        <w:t>DEPARTMENT OF COMPUTER SCIENCE &amp; ENGINEERING</w:t>
+        <w:t>ACADEMIC PROJECT REPORT</w:t>
         <w:br/>
-        <w:t>OPERATING SYSTEMS (CS3001) — MODULE 1</w:t>
+        <w:t>OPERATING SYSTEM ARCHITECTURE LAB (OS-ArchLab)</w:t>
       </w:r>
     </w:p>
     <w:p>
       <w:pPr>
-        <w:spacing w:before="160" w:after="80"/>
         <w:jc w:val="center"/>
       </w:pPr>
       <w:r>
         <w:rPr>
-          <w:rFonts w:ascii="Calibri" w:hAnsi="Calibri"/>
-          <w:b/>
-          <w:color w:val="0F172A"/>
-          <w:sz w:val="48"/>
+          <w:color w:val="475569"/>
+          <w:sz w:val="24"/>
         </w:rPr>
-        <w:t>ACADEMIC PROJECT REPORT</w:t>
+        <w:t>A Cycle-Accurate Visual Simulation Workbench for Direct Memory Access (DMA)</w:t>
+        <w:br/>
+        <w:t>and Multicore vs. Multiprocessor Computer System Architectures</w:t>
       </w:r>
     </w:p>
     <w:p>
       <w:pPr>
-        <w:spacing w:after="320"/>
         <w:jc w:val="center"/>
       </w:pPr>
       <w:r>
         <w:rPr>
-          <w:rFonts w:ascii="Calibri" w:hAnsi="Calibri"/>
-          <w:color w:val="64748B"/>
-          <w:sz w:val="24"/>
+          <w:i/>
+          <w:sz w:val="20"/>
         </w:rPr>
-        <w:t>Operating System Visualization &amp; Simulation Platform</w:t>
+        <w:t>Course Title: Operating Systems (CS3001)  •  Academic Module: Module 1 (Computer System Architecture)</w:t>
         <w:br/>
-        <w:t>An Interactive Architectural Workbench for Direct Memory Access (DMA) and Multicore vs. Multiprocessor Organizations</w:t>
-      </w:r>
-    </w:p>
-    <w:tbl>
-      <w:tblPr>
-        <w:tblW w:type="auto" w:w="0"/>
-        <w:jc w:val="center"/>
-        <w:tblLayout w:type="fixed"/>
-        <w:tblLook w:firstColumn="1" w:firstRow="1" w:lastColumn="0" w:lastRow="0" w:noHBand="0" w:noVBand="1" w:val="04A0"/>
-        <w:tblBorders>
-          <w:top w:val="single" w:sz="6" w:space="0" w:color="CBD5E1"/>
-          <w:left w:val="single" w:sz="6" w:space="0" w:color="CBD5E1"/>
-          <w:bottom w:val="single" w:sz="6" w:space="0" w:color="CBD5E1"/>
-          <w:right w:val="single" w:sz="6" w:space="0" w:color="CBD5E1"/>
-          <w:insideH w:val="single" w:sz="6" w:space="0" w:color="CBD5E1"/>
-          <w:insideV w:val="single" w:sz="6" w:space="0" w:color="CBD5E1"/>
-        </w:tblBorders>
-      </w:tblPr>
-      <w:tblGrid>
-        <w:gridCol w:w="4968"/>
-        <w:gridCol w:w="4968"/>
-      </w:tblGrid>
-      <w:tr>
-        <w:tc>
-          <w:tcPr>
-            <w:tcW w:type="dxa" w:w="4896"/>
-            <w:shd w:fill="F8FAFC"/>
-            <w:tcMar>
-              <w:top w:w="120" w:type="dxa"/>
-              <w:bottom w:w="120" w:type="dxa"/>
-              <w:left w:w="150" w:type="dxa"/>
-              <w:right w:w="150" w:type="dxa"/>
-            </w:tcMar>
-          </w:tcPr>
-          <w:p>
-            <w:pPr>
-              <w:spacing w:after="40"/>
-            </w:pPr>
-            <w:r>
-              <w:rPr>
-                <w:b/>
-                <w:color w:val="0F172A"/>
-              </w:rPr>
-              <w:t xml:space="preserve">Course Title: </w:t>
-            </w:r>
-            <w:r>
-              <w:t>Operating Systems (CS3001)</w:t>
-              <w:br/>
-            </w:r>
-            <w:r>
-              <w:rPr>
-                <w:b/>
-                <w:color w:val="0F172A"/>
-              </w:rPr>
-              <w:t xml:space="preserve">Academic Module: </w:t>
-            </w:r>
-            <w:r>
-              <w:t>Module 1 (Architecture &amp; Overview)</w:t>
-              <w:br/>
-            </w:r>
-            <w:r>
-              <w:rPr>
-                <w:b/>
-                <w:color w:val="0F172A"/>
-              </w:rPr>
-              <w:t xml:space="preserve">Date of Submission: </w:t>
-            </w:r>
-            <w:r>
-              <w:t>October 24, 2026</w:t>
-            </w:r>
-          </w:p>
-        </w:tc>
-        <w:tc>
-          <w:tcPr>
-            <w:tcW w:type="dxa" w:w="4896"/>
-            <w:shd w:fill="F8FAFC"/>
-            <w:tcMar>
-              <w:top w:w="120" w:type="dxa"/>
-              <w:bottom w:w="120" w:type="dxa"/>
-              <w:left w:w="150" w:type="dxa"/>
-              <w:right w:w="150" w:type="dxa"/>
-            </w:tcMar>
-          </w:tcPr>
-          <w:p>
-            <w:pPr>
-              <w:spacing w:after="40"/>
-            </w:pPr>
-            <w:r>
-              <w:rPr>
-                <w:b/>
-                <w:color w:val="2563EB"/>
-              </w:rPr>
-              <w:t>Submitted To:</w:t>
-              <w:br/>
-            </w:r>
-            <w:r>
-              <w:rPr>
-                <w:b/>
-                <w:color w:val="0F172A"/>
-                <w:sz w:val="21"/>
-              </w:rPr>
-              <w:t>Prof. Shivashish Gour</w:t>
-              <w:br/>
-            </w:r>
-            <w:r>
-              <w:t>Dept. of Computer Science &amp; Engineering</w:t>
-              <w:br/>
-              <w:br/>
-            </w:r>
-            <w:r>
-              <w:rPr>
-                <w:b/>
-                <w:color w:val="0F172A"/>
-              </w:rPr>
-              <w:t>Submitted By (Project Team):</w:t>
-              <w:br/>
-            </w:r>
-            <w:r>
-              <w:rPr>
-                <w:b/>
-              </w:rPr>
-              <w:t xml:space="preserve">• Nikhil </w:t>
-            </w:r>
-            <w:r>
-              <w:t>(DMA Subsystem &amp; Bus Engine)</w:t>
-              <w:br/>
-            </w:r>
-            <w:r>
-              <w:rPr>
-                <w:b/>
-              </w:rPr>
-              <w:t xml:space="preserve">• Sakshi </w:t>
-            </w:r>
-            <w:r>
-              <w:t>(Multicore/MP &amp; Fault Engine)</w:t>
-            </w:r>
-          </w:p>
-        </w:tc>
-      </w:tr>
-    </w:tbl>
-    <w:p>
-      <w:pPr>
-        <w:spacing w:after="120"/>
-      </w:pPr>
-    </w:p>
-    <w:p>
-      <w:pPr>
-        <w:keepNext/>
-        <w:spacing w:before="320" w:after="120"/>
-      </w:pPr>
-      <w:r>
-        <w:rPr>
-          <w:rFonts w:ascii="Calibri" w:hAnsi="Calibri"/>
-          <w:b/>
-          <w:color w:val="0F172A"/>
-          <w:sz w:val="27"/>
-        </w:rPr>
-        <w:t>Project Team &amp; Individual Contributions</w:t>
+        <w:t>Faculty Evaluator: Prof. Shivashish Gour  •  Department of Computer Science &amp; Engineering</w:t>
+        <w:br/>
+        <w:t>Date of Final Submission: October 31, 2026</w:t>
+        <w:br/>
       </w:r>
     </w:p>
     <w:p>
       <w:pPr>
-        <w:spacing w:after="120" w:line="276" w:lineRule="auto"/>
+        <w:pStyle w:val="Heading1"/>
       </w:pPr>
       <w:r>
-        <w:rPr>
-          <w:rFonts w:ascii="Calibri" w:hAnsi="Calibri"/>
-          <w:color w:val="1E293B"/>
-          <w:sz w:val="19"/>
-        </w:rPr>
-        <w:t>The engineering work was partitioned into two distinct micro-architectural domains:</w:t>
+        <w:t>1. Project Team &amp; Contribution Breakdown</w:t>
       </w:r>
     </w:p>
     <w:tbl>
@@ -224,42 +61,31 @@
         <w:tblW w:type="auto" w:w="0"/>
         <w:jc w:val="center"/>
         <w:tblLook w:firstColumn="1" w:firstRow="1" w:lastColumn="0" w:lastRow="0" w:noHBand="0" w:noVBand="1" w:val="04A0"/>
-        <w:tblBorders>
-          <w:top w:val="single" w:sz="4" w:space="0" w:color="CBD5E1"/>
-          <w:left w:val="single" w:sz="4" w:space="0" w:color="CBD5E1"/>
-          <w:bottom w:val="single" w:sz="4" w:space="0" w:color="CBD5E1"/>
-          <w:right w:val="single" w:sz="4" w:space="0" w:color="CBD5E1"/>
-          <w:insideH w:val="single" w:sz="4" w:space="0" w:color="CBD5E1"/>
-          <w:insideV w:val="single" w:sz="4" w:space="0" w:color="CBD5E1"/>
-        </w:tblBorders>
       </w:tblPr>
       <w:tblGrid>
-        <w:gridCol w:w="3312"/>
-        <w:gridCol w:w="3312"/>
-        <w:gridCol w:w="3312"/>
+        <w:gridCol w:w="3120"/>
+        <w:gridCol w:w="3120"/>
+        <w:gridCol w:w="3120"/>
       </w:tblGrid>
       <w:tr>
         <w:tc>
           <w:tcPr>
-            <w:tcW w:type="dxa" w:w="1872"/>
-            <w:shd w:fill="1E293B"/>
+            <w:tcW w:type="dxa" w:w="3120"/>
+            <w:vAlign w:val="center"/>
             <w:tcMar>
-              <w:top w:w="80" w:type="dxa"/>
-              <w:bottom w:w="80" w:type="dxa"/>
-              <w:left w:w="100" w:type="dxa"/>
-              <w:right w:w="100" w:type="dxa"/>
+              <w:top w:w="120" w:type="dxa"/>
+              <w:bottom w:w="120" w:type="dxa"/>
+              <w:left w:w="150" w:type="dxa"/>
+              <w:right w:w="150" w:type="dxa"/>
             </w:tcMar>
+            <w:shd w:fill="0052FF"/>
           </w:tcPr>
           <w:p>
-            <w:pPr>
-              <w:spacing w:after="0"/>
-            </w:pPr>
             <w:r>
               <w:rPr>
-                <w:rFonts w:ascii="Calibri" w:hAnsi="Calibri"/>
                 <w:b/>
                 <w:color w:val="FFFFFF"/>
-                <w:sz w:val="18"/>
+                <w:sz w:val="20"/>
               </w:rPr>
               <w:t>Team Member</w:t>
             </w:r>
@@ -267,53 +93,47 @@
         </w:tc>
         <w:tc>
           <w:tcPr>
-            <w:tcW w:type="dxa" w:w="5328"/>
-            <w:shd w:fill="1E293B"/>
+            <w:tcW w:type="dxa" w:w="3120"/>
+            <w:vAlign w:val="center"/>
             <w:tcMar>
-              <w:top w:w="80" w:type="dxa"/>
-              <w:bottom w:w="80" w:type="dxa"/>
-              <w:left w:w="100" w:type="dxa"/>
-              <w:right w:w="100" w:type="dxa"/>
+              <w:top w:w="120" w:type="dxa"/>
+              <w:bottom w:w="120" w:type="dxa"/>
+              <w:left w:w="150" w:type="dxa"/>
+              <w:right w:w="150" w:type="dxa"/>
             </w:tcMar>
+            <w:shd w:fill="0052FF"/>
           </w:tcPr>
           <w:p>
-            <w:pPr>
-              <w:spacing w:after="0"/>
-            </w:pPr>
             <w:r>
               <w:rPr>
-                <w:rFonts w:ascii="Calibri" w:hAnsi="Calibri"/>
                 <w:b/>
                 <w:color w:val="FFFFFF"/>
-                <w:sz w:val="18"/>
+                <w:sz w:val="20"/>
               </w:rPr>
-              <w:t>Module &amp; Primary Responsibilities</w:t>
+              <w:t>Module &amp; Primary Architectural Responsibilities</w:t>
             </w:r>
           </w:p>
         </w:tc>
         <w:tc>
           <w:tcPr>
-            <w:tcW w:type="dxa" w:w="2592"/>
-            <w:shd w:fill="1E293B"/>
+            <w:tcW w:type="dxa" w:w="3120"/>
+            <w:vAlign w:val="center"/>
             <w:tcMar>
-              <w:top w:w="80" w:type="dxa"/>
-              <w:bottom w:w="80" w:type="dxa"/>
-              <w:left w:w="100" w:type="dxa"/>
-              <w:right w:w="100" w:type="dxa"/>
+              <w:top w:w="120" w:type="dxa"/>
+              <w:bottom w:w="120" w:type="dxa"/>
+              <w:left w:w="150" w:type="dxa"/>
+              <w:right w:w="150" w:type="dxa"/>
             </w:tcMar>
+            <w:shd w:fill="0052FF"/>
           </w:tcPr>
           <w:p>
-            <w:pPr>
-              <w:spacing w:after="0"/>
-            </w:pPr>
             <w:r>
               <w:rPr>
-                <w:rFonts w:ascii="Calibri" w:hAnsi="Calibri"/>
                 <w:b/>
                 <w:color w:val="FFFFFF"/>
-                <w:sz w:val="18"/>
+                <w:sz w:val="20"/>
               </w:rPr>
-              <w:t>Key Code &amp; Test Deliverables</w:t>
+              <w:t>Key Technical Deliverables</w:t>
             </w:r>
           </w:p>
         </w:tc>
@@ -321,25 +141,21 @@
       <w:tr>
         <w:tc>
           <w:tcPr>
-            <w:tcW w:type="dxa" w:w="1872"/>
-            <w:shd w:fill="F8FAFC"/>
+            <w:tcW w:type="dxa" w:w="3120"/>
+            <w:vAlign w:val="center"/>
             <w:tcMar>
-              <w:top w:w="80" w:type="dxa"/>
-              <w:bottom w:w="80" w:type="dxa"/>
-              <w:left w:w="100" w:type="dxa"/>
-              <w:right w:w="100" w:type="dxa"/>
+              <w:top w:w="120" w:type="dxa"/>
+              <w:bottom w:w="120" w:type="dxa"/>
+              <w:left w:w="150" w:type="dxa"/>
+              <w:right w:w="150" w:type="dxa"/>
             </w:tcMar>
+            <w:shd w:fill="FFFFFF"/>
           </w:tcPr>
           <w:p>
-            <w:pPr>
-              <w:spacing w:after="0"/>
-            </w:pPr>
             <w:r>
               <w:rPr>
-                <w:rFonts w:ascii="Calibri" w:hAnsi="Calibri"/>
-                <w:b/>
-                <w:color w:val="2563EB"/>
-                <w:sz w:val="20"/>
+                <w:color w:val="1E293B"/>
+                <w:sz w:val="19"/>
               </w:rPr>
               <w:t>Nikhil</w:t>
             </w:r>
@@ -347,59 +163,59 @@
         </w:tc>
         <w:tc>
           <w:tcPr>
-            <w:tcW w:type="dxa" w:w="5328"/>
-            <w:shd w:fill="F8FAFC"/>
+            <w:tcW w:type="dxa" w:w="3120"/>
+            <w:vAlign w:val="center"/>
             <w:tcMar>
-              <w:top w:w="80" w:type="dxa"/>
-              <w:bottom w:w="80" w:type="dxa"/>
-              <w:left w:w="100" w:type="dxa"/>
-              <w:right w:w="100" w:type="dxa"/>
+              <w:top w:w="120" w:type="dxa"/>
+              <w:bottom w:w="120" w:type="dxa"/>
+              <w:left w:w="150" w:type="dxa"/>
+              <w:right w:w="150" w:type="dxa"/>
             </w:tcMar>
+            <w:shd w:fill="FFFFFF"/>
           </w:tcPr>
           <w:p>
-            <w:pPr>
-              <w:spacing w:after="0"/>
-            </w:pPr>
             <w:r>
               <w:rPr>
-                <w:rFonts w:ascii="Calibri" w:hAnsi="Calibri"/>
-                <w:sz w:val="17"/>
+                <w:color w:val="1E293B"/>
+                <w:sz w:val="19"/>
               </w:rPr>
-              <w:t>Topic 5: Direct Memory Access (DMA) &amp; Bus Arbitration</w:t>
+              <w:t>Topic 5: Direct Memory Access (DMA) &amp; Bus Arbitration Subsystem</w:t>
               <w:br/>
-              <w:t>• 8237 DMA Finite State Machine &amp; HOLD/HLDA Handshake</w:t>
+              <w:t>• Intel 8237 Finite State Machine &amp; Hardware HOLD/HLDA Handshaking</w:t>
               <w:br/>
-              <w:t>• 20-Cycle Logic Analyzer Oscilloscope Waveform</w:t>
+              <w:t>• 24-Cycle Logic Analyzer Oscilloscope Waveform &amp; Timing Engine</w:t>
               <w:br/>
-              <w:t>• Crossbar Highway Arbiter &amp; Contention Turnstile Queue</w:t>
+              <w:t>• Interactive HUD Circular Gauges (Contention Injector, PCIe Speed Multiplier, CPU Clock Overclocking)</w:t>
+              <w:br/>
+              <w:t>• CPU Microarchitecture Silicon ALU &amp; Register Bank X-Ray Popover Modal</w:t>
+              <w:br/>
+              <w:t>• Fullscreen Presentation Cinema Mode Engine &amp; Post Startup Boot Sequence</w:t>
             </w:r>
           </w:p>
         </w:tc>
         <w:tc>
           <w:tcPr>
-            <w:tcW w:type="dxa" w:w="2592"/>
-            <w:shd w:fill="F8FAFC"/>
+            <w:tcW w:type="dxa" w:w="3120"/>
+            <w:vAlign w:val="center"/>
             <w:tcMar>
-              <w:top w:w="80" w:type="dxa"/>
-              <w:bottom w:w="80" w:type="dxa"/>
-              <w:left w:w="100" w:type="dxa"/>
-              <w:right w:w="100" w:type="dxa"/>
+              <w:top w:w="120" w:type="dxa"/>
+              <w:bottom w:w="120" w:type="dxa"/>
+              <w:left w:w="150" w:type="dxa"/>
+              <w:right w:w="150" w:type="dxa"/>
             </w:tcMar>
+            <w:shd w:fill="FFFFFF"/>
           </w:tcPr>
           <w:p>
-            <w:pPr>
-              <w:spacing w:after="0"/>
-            </w:pPr>
             <w:r>
               <w:rPr>
-                <w:rFonts w:ascii="Consolas" w:hAnsi="Consolas"/>
-                <w:sz w:val="16"/>
+                <w:color w:val="1E293B"/>
+                <w:sz w:val="19"/>
               </w:rPr>
-              <w:t>DmaSimulator.jsx</w:t>
+              <w:t>src/components/DmaSimulator.jsx</w:t>
               <w:br/>
-              <w:t>UnifiedSystemLab.jsx</w:t>
+              <w:t>standalone.html (Tab 1)</w:t>
               <w:br/>
-              <w:t>Test Case 1 Verification</w:t>
+              <w:t>Hardware Test Case 1 Verification</w:t>
             </w:r>
           </w:p>
         </w:tc>
@@ -407,25 +223,21 @@
       <w:tr>
         <w:tc>
           <w:tcPr>
-            <w:tcW w:type="dxa" w:w="1872"/>
-            <w:shd w:fill="FFFFFF"/>
+            <w:tcW w:type="dxa" w:w="3120"/>
+            <w:vAlign w:val="center"/>
             <w:tcMar>
-              <w:top w:w="80" w:type="dxa"/>
-              <w:bottom w:w="80" w:type="dxa"/>
-              <w:left w:w="100" w:type="dxa"/>
-              <w:right w:w="100" w:type="dxa"/>
+              <w:top w:w="120" w:type="dxa"/>
+              <w:bottom w:w="120" w:type="dxa"/>
+              <w:left w:w="150" w:type="dxa"/>
+              <w:right w:w="150" w:type="dxa"/>
             </w:tcMar>
+            <w:shd w:fill="F8FAFC"/>
           </w:tcPr>
           <w:p>
-            <w:pPr>
-              <w:spacing w:after="0"/>
-            </w:pPr>
             <w:r>
               <w:rPr>
-                <w:rFonts w:ascii="Calibri" w:hAnsi="Calibri"/>
-                <w:b/>
-                <w:color w:val="2563EB"/>
-                <w:sz w:val="20"/>
+                <w:color w:val="1E293B"/>
+                <w:sz w:val="19"/>
               </w:rPr>
               <w:t>Sakshi</w:t>
             </w:r>
@@ -433,136 +245,137 @@
         </w:tc>
         <w:tc>
           <w:tcPr>
-            <w:tcW w:type="dxa" w:w="5328"/>
-            <w:shd w:fill="FFFFFF"/>
+            <w:tcW w:type="dxa" w:w="3120"/>
+            <w:vAlign w:val="center"/>
             <w:tcMar>
-              <w:top w:w="80" w:type="dxa"/>
-              <w:bottom w:w="80" w:type="dxa"/>
-              <w:left w:w="100" w:type="dxa"/>
-              <w:right w:w="100" w:type="dxa"/>
+              <w:top w:w="120" w:type="dxa"/>
+              <w:bottom w:w="120" w:type="dxa"/>
+              <w:left w:w="150" w:type="dxa"/>
+              <w:right w:w="150" w:type="dxa"/>
             </w:tcMar>
+            <w:shd w:fill="F8FAFC"/>
           </w:tcPr>
           <w:p>
-            <w:pPr>
-              <w:spacing w:after="0"/>
-            </w:pPr>
             <w:r>
               <w:rPr>
-                <w:rFonts w:ascii="Calibri" w:hAnsi="Calibri"/>
-                <w:sz w:val="17"/>
+                <w:color w:val="1E293B"/>
+                <w:sz w:val="19"/>
               </w:rPr>
-              <w:t>Topic 6: Multicore vs. Multiprocessor Organizations</w:t>
+              <w:t>Topic 6: Multicore vs. Multiprocessor Organization Subsystem</w:t>
               <w:br/>
-              <w:t>• 2/4/8 Core Die Scaler &amp; Thermal Hotspot Engine (48°-89°C)</w:t>
+              <w:t>• Dynamic Silicon Core Scaler (2, 4, 8 Cores) with Thermal Throttling Modeling (48°C to 89°C alert)</w:t>
               <w:br/>
-              <w:t>• SMP vs. Distributed RAM &amp; L3 Cache Ring Bus Model</w:t>
+              <w:t>• Memory Topologies: Symmetric Multiprocessing (SMP) vs. Distributed NUMA Models</w:t>
               <w:br/>
-              <w:t>• Fault Injection Engine (Die Overheat vs. Socket Pull)</w:t>
+              <w:t>• On-Chip L3 Cache vs. Off-Chip Motherboard Bus Memory Access Tracing (0.8ns vs. 65ns)</w:t>
+              <w:br/>
+              <w:t>• Hardware Fault Injection Engine: Silicon Die Overheat (105°C) vs. Hot-Swappable Socket Pull</w:t>
+              <w:br/>
+              <w:t>• Workload Performance Benchmarking (Single Multi-Threaded Program vs. Independent Server Jobs)</w:t>
             </w:r>
           </w:p>
         </w:tc>
         <w:tc>
           <w:tcPr>
-            <w:tcW w:type="dxa" w:w="2592"/>
-            <w:shd w:fill="FFFFFF"/>
+            <w:tcW w:type="dxa" w:w="3120"/>
+            <w:vAlign w:val="center"/>
             <w:tcMar>
-              <w:top w:w="80" w:type="dxa"/>
-              <w:bottom w:w="80" w:type="dxa"/>
-              <w:left w:w="100" w:type="dxa"/>
-              <w:right w:w="100" w:type="dxa"/>
+              <w:top w:w="120" w:type="dxa"/>
+              <w:bottom w:w="120" w:type="dxa"/>
+              <w:left w:w="150" w:type="dxa"/>
+              <w:right w:w="150" w:type="dxa"/>
             </w:tcMar>
+            <w:shd w:fill="F8FAFC"/>
           </w:tcPr>
           <w:p>
-            <w:pPr>
-              <w:spacing w:after="0"/>
-            </w:pPr>
             <w:r>
               <w:rPr>
-                <w:rFonts w:ascii="Consolas" w:hAnsi="Consolas"/>
-                <w:sz w:val="16"/>
+                <w:color w:val="1E293B"/>
+                <w:sz w:val="19"/>
               </w:rPr>
-              <w:t>MultiArchitectureComparator.jsx</w:t>
+              <w:t>src/components/MultiArchitectureComparator.jsx</w:t>
               <w:br/>
-              <w:t>OsEvolutionTimeMachine.jsx</w:t>
+              <w:t>standalone.html (Tab 2)</w:t>
               <w:br/>
-              <w:t>Test Cases 2 &amp; 3</w:t>
+              <w:t>Hardware Test Cases 2 &amp; 3 Verification</w:t>
             </w:r>
           </w:p>
         </w:tc>
       </w:tr>
     </w:tbl>
+    <w:tbl>
+      <w:tblPr>
+        <w:tblW w:type="auto" w:w="0"/>
+        <w:jc w:val="center"/>
+        <w:tblLook w:firstColumn="1" w:firstRow="1" w:lastColumn="0" w:lastRow="0" w:noHBand="0" w:noVBand="1" w:val="04A0"/>
+      </w:tblPr>
+      <w:tblGrid>
+        <w:gridCol w:w="9360"/>
+      </w:tblGrid>
+      <w:tr>
+        <w:tc>
+          <w:tcPr>
+            <w:tcW w:type="dxa" w:w="9360"/>
+            <w:shd w:fill="F0F4FF"/>
+            <w:tcMar>
+              <w:top w:w="140" w:type="dxa"/>
+              <w:bottom w:w="140" w:type="dxa"/>
+              <w:left w:w="200" w:type="dxa"/>
+              <w:right w:w="200" w:type="dxa"/>
+            </w:tcMar>
+            <w:tcBorders>
+              <w:top w:val="none"/>
+              <w:left w:val="single" w:sz="36" w:space="0" w:color="0052FF"/>
+              <w:bottom w:val="none"/>
+              <w:right w:val="none"/>
+            </w:tcBorders>
+          </w:tcPr>
+          <w:p>
+            <w:pPr>
+              <w:spacing w:before="0" w:after="40"/>
+            </w:pPr>
+            <w:r>
+              <w:rPr>
+                <w:b/>
+                <w:color w:val="0052FF"/>
+                <w:sz w:val="20"/>
+              </w:rPr>
+              <w:t xml:space="preserve">[SYLLABUS COMPLIANCE &amp; SCOPE] </w:t>
+            </w:r>
+            <w:r>
+              <w:rPr>
+                <w:color w:val="1E293B"/>
+                <w:sz w:val="20"/>
+              </w:rPr>
+              <w:t>This academic project implements a cycle-accurate, real-time interactive simulation platform developed to substantiate and visually verify the architectural concepts taught in Module 1: Topic 5 (Direct Memory Access, Slides 13-15) and Topic 6 (Multiprocessor vs. Multicore Organizations, Slides 16-20).</w:t>
+            </w:r>
+          </w:p>
+        </w:tc>
+      </w:tr>
+    </w:tbl>
+    <w:p/>
     <w:p>
       <w:pPr>
-        <w:spacing w:after="120"/>
+        <w:pStyle w:val="Heading1"/>
       </w:pPr>
+      <w:r>
+        <w:t>2. Executive Summary &amp; Problem Statement</w:t>
+      </w:r>
     </w:p>
     <w:p>
-      <w:pPr>
-        <w:keepNext/>
-        <w:spacing w:before="320" w:after="120"/>
-      </w:pPr>
       <w:r>
-        <w:rPr>
-          <w:rFonts w:ascii="Calibri" w:hAnsi="Calibri"/>
-          <w:b/>
-          <w:color w:val="0F172A"/>
-          <w:sz w:val="27"/>
-        </w:rPr>
-        <w:t>1. Executive Summary &amp; Abstract</w:t>
+        <w:t>Traditional classroom instruction in Operating Systems frequently encounters pedagogical bottlenecks when communicating low-level hardware concurrency. Micro-architectural mechanisms—such as the hardware bus release handshake between the CPU and the DMA controller, cycle-level processor stalls, bus contention turnstiles, and inter-core cache snooping latencies—occur at nanosecond scales within closed integrated circuits. Consequently, students frequently memorize comparison tables (e.g., Slide 20) without internalizing the underlying physical trade-offs.</w:t>
+        <w:br/>
+        <w:br/>
+        <w:t>To resolve this educational gap, the OS-ArchLab Platform was engineered. Built upon modern reactive frontend systems (React 19, Vite, HTML5 Canvas/SVG, standalone zero-dependency distribution), the platform models discrete clock pulses, animated electrical bus lines, live hardware registers, DRAM memory cell allocations, 24-cycle logic analyzer waveforms, and runtime fault injection (Thermal Die Overheating and Physical CPU Socket Disconnection).</w:t>
       </w:r>
     </w:p>
     <w:p>
       <w:pPr>
-        <w:spacing w:after="120" w:line="276" w:lineRule="auto"/>
+        <w:pStyle w:val="Heading1"/>
       </w:pPr>
       <w:r>
-        <w:rPr>
-          <w:rFonts w:ascii="Calibri" w:hAnsi="Calibri"/>
-          <w:color w:val="1E293B"/>
-          <w:sz w:val="19"/>
-        </w:rPr>
-        <w:t>Traditional classroom instruction in Operating Systems frequently encounters pedagogical bottlenecks when communicating low-level hardware concurrency. Micro-architectural mechanisms—such as the hardware bus release handshake between the CPU and the DMA controller, cycle-level processor stalls, bus contention turnstiles, and inter-core cache snooping latencies—occur at nanosecond scales within closed integrated circuits. Consequently, students frequently memorize comparison tables (e.g., Slide 20) without internalizing the physical trade-offs.</w:t>
-      </w:r>
-    </w:p>
-    <w:p>
-      <w:pPr>
-        <w:spacing w:after="120" w:line="276" w:lineRule="auto"/>
-      </w:pPr>
-      <w:r>
-        <w:rPr>
-          <w:rFonts w:ascii="Calibri" w:hAnsi="Calibri"/>
-          <w:color w:val="1E293B"/>
-          <w:sz w:val="19"/>
-        </w:rPr>
-        <w:t>To resolve this educational gap, the OS-ArchLab Platform was designed, engineered, and verified. Built upon modern reactive frontend systems (Node.js, React 19, Vite) and rendered with hardware-accelerated Cyberpunk telemetry animations, the platform models discrete system clock pulses, animated electrical bus lines, live hardware registers, DRAM memory cell allocations, 20-cycle logic analyzer waveforms, and runtime fault injection (Thermal Die Overheating and Physical CPU Socket Disconnection).</w:t>
-      </w:r>
-    </w:p>
-    <w:p>
-      <w:pPr>
-        <w:keepNext/>
-        <w:spacing w:before="320" w:after="120"/>
-      </w:pPr>
-      <w:r>
-        <w:rPr>
-          <w:rFonts w:ascii="Calibri" w:hAnsi="Calibri"/>
-          <w:b/>
-          <w:color w:val="0F172A"/>
-          <w:sz w:val="27"/>
-        </w:rPr>
-        <w:t>2. Curriculum Mapping &amp; Syllabus Alignment</w:t>
-      </w:r>
-    </w:p>
-    <w:p>
-      <w:pPr>
-        <w:spacing w:after="120" w:line="276" w:lineRule="auto"/>
-      </w:pPr>
-      <w:r>
-        <w:rPr>
-          <w:rFonts w:ascii="Calibri" w:hAnsi="Calibri"/>
-          <w:color w:val="1E293B"/>
-          <w:sz w:val="19"/>
-        </w:rPr>
-        <w:t>The simulation modules map directly to the official syllabus lecture slides of Module 1: Operating System Overview:</w:t>
+        <w:t>3. Curriculum Mapping &amp; Syllabus Alignment</w:t>
       </w:r>
     </w:p>
     <w:tbl>
@@ -570,43 +383,32 @@
         <w:tblW w:type="auto" w:w="0"/>
         <w:jc w:val="center"/>
         <w:tblLook w:firstColumn="1" w:firstRow="1" w:lastColumn="0" w:lastRow="0" w:noHBand="0" w:noVBand="1" w:val="04A0"/>
-        <w:tblBorders>
-          <w:top w:val="single" w:sz="4" w:space="0" w:color="CBD5E1"/>
-          <w:left w:val="single" w:sz="4" w:space="0" w:color="CBD5E1"/>
-          <w:bottom w:val="single" w:sz="4" w:space="0" w:color="CBD5E1"/>
-          <w:right w:val="single" w:sz="4" w:space="0" w:color="CBD5E1"/>
-          <w:insideH w:val="single" w:sz="4" w:space="0" w:color="CBD5E1"/>
-          <w:insideV w:val="single" w:sz="4" w:space="0" w:color="CBD5E1"/>
-        </w:tblBorders>
       </w:tblPr>
       <w:tblGrid>
-        <w:gridCol w:w="2484"/>
-        <w:gridCol w:w="2484"/>
-        <w:gridCol w:w="2484"/>
-        <w:gridCol w:w="2484"/>
+        <w:gridCol w:w="2340"/>
+        <w:gridCol w:w="2340"/>
+        <w:gridCol w:w="2340"/>
+        <w:gridCol w:w="2340"/>
       </w:tblGrid>
       <w:tr>
         <w:tc>
           <w:tcPr>
-            <w:tcW w:type="dxa" w:w="2592"/>
-            <w:shd w:fill="1E293B"/>
+            <w:tcW w:type="dxa" w:w="2340"/>
+            <w:vAlign w:val="center"/>
             <w:tcMar>
-              <w:top w:w="80" w:type="dxa"/>
-              <w:bottom w:w="80" w:type="dxa"/>
-              <w:left w:w="80" w:type="dxa"/>
-              <w:right w:w="80" w:type="dxa"/>
+              <w:top w:w="120" w:type="dxa"/>
+              <w:bottom w:w="120" w:type="dxa"/>
+              <w:left w:w="150" w:type="dxa"/>
+              <w:right w:w="150" w:type="dxa"/>
             </w:tcMar>
+            <w:shd w:fill="0052FF"/>
           </w:tcPr>
           <w:p>
-            <w:pPr>
-              <w:spacing w:after="0"/>
-            </w:pPr>
             <w:r>
               <w:rPr>
-                <w:rFonts w:ascii="Calibri" w:hAnsi="Calibri"/>
                 <w:b/>
                 <w:color w:val="FFFFFF"/>
-                <w:sz w:val="17"/>
+                <w:sz w:val="20"/>
               </w:rPr>
               <w:t>Syllabus Topic</w:t>
             </w:r>
@@ -614,25 +416,22 @@
         </w:tc>
         <w:tc>
           <w:tcPr>
-            <w:tcW w:type="dxa" w:w="1584"/>
-            <w:shd w:fill="1E293B"/>
+            <w:tcW w:type="dxa" w:w="2340"/>
+            <w:vAlign w:val="center"/>
             <w:tcMar>
-              <w:top w:w="80" w:type="dxa"/>
-              <w:bottom w:w="80" w:type="dxa"/>
-              <w:left w:w="80" w:type="dxa"/>
-              <w:right w:w="80" w:type="dxa"/>
+              <w:top w:w="120" w:type="dxa"/>
+              <w:bottom w:w="120" w:type="dxa"/>
+              <w:left w:w="150" w:type="dxa"/>
+              <w:right w:w="150" w:type="dxa"/>
             </w:tcMar>
+            <w:shd w:fill="0052FF"/>
           </w:tcPr>
           <w:p>
-            <w:pPr>
-              <w:spacing w:after="0"/>
-            </w:pPr>
             <w:r>
               <w:rPr>
-                <w:rFonts w:ascii="Calibri" w:hAnsi="Calibri"/>
                 <w:b/>
                 <w:color w:val="FFFFFF"/>
-                <w:sz w:val="17"/>
+                <w:sz w:val="20"/>
               </w:rPr>
               <w:t>Lecture Slide Ref.</w:t>
             </w:r>
@@ -640,25 +439,22 @@
         </w:tc>
         <w:tc>
           <w:tcPr>
-            <w:tcW w:type="dxa" w:w="3456"/>
-            <w:shd w:fill="1E293B"/>
+            <w:tcW w:type="dxa" w:w="2340"/>
+            <w:vAlign w:val="center"/>
             <w:tcMar>
-              <w:top w:w="80" w:type="dxa"/>
-              <w:bottom w:w="80" w:type="dxa"/>
-              <w:left w:w="80" w:type="dxa"/>
-              <w:right w:w="80" w:type="dxa"/>
+              <w:top w:w="120" w:type="dxa"/>
+              <w:bottom w:w="120" w:type="dxa"/>
+              <w:left w:w="150" w:type="dxa"/>
+              <w:right w:w="150" w:type="dxa"/>
             </w:tcMar>
+            <w:shd w:fill="0052FF"/>
           </w:tcPr>
           <w:p>
-            <w:pPr>
-              <w:spacing w:after="0"/>
-            </w:pPr>
             <w:r>
               <w:rPr>
-                <w:rFonts w:ascii="Calibri" w:hAnsi="Calibri"/>
                 <w:b/>
                 <w:color w:val="FFFFFF"/>
-                <w:sz w:val="17"/>
+                <w:sz w:val="20"/>
               </w:rPr>
               <w:t>Conceptual Core</w:t>
             </w:r>
@@ -666,27 +462,24 @@
         </w:tc>
         <w:tc>
           <w:tcPr>
-            <w:tcW w:type="dxa" w:w="2160"/>
-            <w:shd w:fill="1E293B"/>
+            <w:tcW w:type="dxa" w:w="2340"/>
+            <w:vAlign w:val="center"/>
             <w:tcMar>
-              <w:top w:w="80" w:type="dxa"/>
-              <w:bottom w:w="80" w:type="dxa"/>
-              <w:left w:w="80" w:type="dxa"/>
-              <w:right w:w="80" w:type="dxa"/>
+              <w:top w:w="120" w:type="dxa"/>
+              <w:bottom w:w="120" w:type="dxa"/>
+              <w:left w:w="150" w:type="dxa"/>
+              <w:right w:w="150" w:type="dxa"/>
             </w:tcMar>
+            <w:shd w:fill="0052FF"/>
           </w:tcPr>
           <w:p>
-            <w:pPr>
-              <w:spacing w:after="0"/>
-            </w:pPr>
             <w:r>
               <w:rPr>
-                <w:rFonts w:ascii="Calibri" w:hAnsi="Calibri"/>
                 <w:b/>
                 <w:color w:val="FFFFFF"/>
-                <w:sz w:val="17"/>
+                <w:sz w:val="20"/>
               </w:rPr>
-              <w:t>Visual Module</w:t>
+              <w:t>Visual Simulation Engine</w:t>
             </w:r>
           </w:p>
         </w:tc>
@@ -694,24 +487,21 @@
       <w:tr>
         <w:tc>
           <w:tcPr>
-            <w:tcW w:type="dxa" w:w="2592"/>
-            <w:shd w:fill="F8FAFC"/>
+            <w:tcW w:type="dxa" w:w="2340"/>
+            <w:vAlign w:val="center"/>
             <w:tcMar>
-              <w:top w:w="70" w:type="dxa"/>
-              <w:bottom w:w="70" w:type="dxa"/>
-              <w:left w:w="80" w:type="dxa"/>
-              <w:right w:w="80" w:type="dxa"/>
+              <w:top w:w="120" w:type="dxa"/>
+              <w:bottom w:w="120" w:type="dxa"/>
+              <w:left w:w="150" w:type="dxa"/>
+              <w:right w:w="150" w:type="dxa"/>
             </w:tcMar>
+            <w:shd w:fill="FFFFFF"/>
           </w:tcPr>
           <w:p>
-            <w:pPr>
-              <w:spacing w:after="0"/>
-            </w:pPr>
             <w:r>
               <w:rPr>
-                <w:rFonts w:ascii="Calibri" w:hAnsi="Calibri"/>
-                <w:b/>
-                <w:sz w:val="16"/>
+                <w:color w:val="1E293B"/>
+                <w:sz w:val="19"/>
               </w:rPr>
               <w:t>Topic 5: Direct Memory Access</w:t>
             </w:r>
@@ -719,23 +509,21 @@
         </w:tc>
         <w:tc>
           <w:tcPr>
-            <w:tcW w:type="dxa" w:w="1584"/>
-            <w:shd w:fill="F8FAFC"/>
+            <w:tcW w:type="dxa" w:w="2340"/>
+            <w:vAlign w:val="center"/>
             <w:tcMar>
-              <w:top w:w="70" w:type="dxa"/>
-              <w:bottom w:w="70" w:type="dxa"/>
-              <w:left w:w="80" w:type="dxa"/>
-              <w:right w:w="80" w:type="dxa"/>
+              <w:top w:w="120" w:type="dxa"/>
+              <w:bottom w:w="120" w:type="dxa"/>
+              <w:left w:w="150" w:type="dxa"/>
+              <w:right w:w="150" w:type="dxa"/>
             </w:tcMar>
+            <w:shd w:fill="FFFFFF"/>
           </w:tcPr>
           <w:p>
-            <w:pPr>
-              <w:spacing w:after="0"/>
-            </w:pPr>
             <w:r>
               <w:rPr>
-                <w:rFonts w:ascii="Calibri" w:hAnsi="Calibri"/>
-                <w:sz w:val="16"/>
+                <w:color w:val="1E293B"/>
+                <w:sz w:val="19"/>
               </w:rPr>
               <w:t>Slide 13</w:t>
             </w:r>
@@ -743,49 +531,45 @@
         </w:tc>
         <w:tc>
           <w:tcPr>
-            <w:tcW w:type="dxa" w:w="3456"/>
-            <w:shd w:fill="F8FAFC"/>
+            <w:tcW w:type="dxa" w:w="2340"/>
+            <w:vAlign w:val="center"/>
             <w:tcMar>
-              <w:top w:w="70" w:type="dxa"/>
-              <w:bottom w:w="70" w:type="dxa"/>
-              <w:left w:w="80" w:type="dxa"/>
-              <w:right w:w="80" w:type="dxa"/>
+              <w:top w:w="120" w:type="dxa"/>
+              <w:bottom w:w="120" w:type="dxa"/>
+              <w:left w:w="150" w:type="dxa"/>
+              <w:right w:w="150" w:type="dxa"/>
             </w:tcMar>
+            <w:shd w:fill="FFFFFF"/>
           </w:tcPr>
           <w:p>
-            <w:pPr>
-              <w:spacing w:after="0"/>
-            </w:pPr>
             <w:r>
               <w:rPr>
-                <w:rFonts w:ascii="Calibri" w:hAnsi="Calibri"/>
-                <w:sz w:val="16"/>
+                <w:color w:val="1E293B"/>
+                <w:sz w:val="19"/>
               </w:rPr>
-              <w:t>DMA Definition, 'Station Master' Analogy, 8237 Controller</w:t>
+              <w:t>DMA Definition, Station Master Analogy, Intel 8237 Architecture</w:t>
             </w:r>
           </w:p>
         </w:tc>
         <w:tc>
           <w:tcPr>
-            <w:tcW w:type="dxa" w:w="2160"/>
-            <w:shd w:fill="F8FAFC"/>
+            <w:tcW w:type="dxa" w:w="2340"/>
+            <w:vAlign w:val="center"/>
             <w:tcMar>
-              <w:top w:w="70" w:type="dxa"/>
-              <w:bottom w:w="70" w:type="dxa"/>
-              <w:left w:w="80" w:type="dxa"/>
-              <w:right w:w="80" w:type="dxa"/>
+              <w:top w:w="120" w:type="dxa"/>
+              <w:bottom w:w="120" w:type="dxa"/>
+              <w:left w:w="150" w:type="dxa"/>
+              <w:right w:w="150" w:type="dxa"/>
             </w:tcMar>
+            <w:shd w:fill="FFFFFF"/>
           </w:tcPr>
           <w:p>
-            <w:pPr>
-              <w:spacing w:after="0"/>
-            </w:pPr>
             <w:r>
               <w:rPr>
-                <w:rFonts w:ascii="Consolas" w:hAnsi="Consolas"/>
-                <w:sz w:val="15"/>
+                <w:color w:val="1E293B"/>
+                <w:sz w:val="19"/>
               </w:rPr>
-              <w:t>DmaSimulator.jsx</w:t>
+              <w:t>DmaSimulator.jsx &amp; standalone.html</w:t>
             </w:r>
           </w:p>
         </w:tc>
@@ -793,24 +577,21 @@
       <w:tr>
         <w:tc>
           <w:tcPr>
-            <w:tcW w:type="dxa" w:w="2592"/>
-            <w:shd w:fill="FFFFFF"/>
+            <w:tcW w:type="dxa" w:w="2340"/>
+            <w:vAlign w:val="center"/>
             <w:tcMar>
-              <w:top w:w="70" w:type="dxa"/>
-              <w:bottom w:w="70" w:type="dxa"/>
-              <w:left w:w="80" w:type="dxa"/>
-              <w:right w:w="80" w:type="dxa"/>
+              <w:top w:w="120" w:type="dxa"/>
+              <w:bottom w:w="120" w:type="dxa"/>
+              <w:left w:w="150" w:type="dxa"/>
+              <w:right w:w="150" w:type="dxa"/>
             </w:tcMar>
+            <w:shd w:fill="F8FAFC"/>
           </w:tcPr>
           <w:p>
-            <w:pPr>
-              <w:spacing w:after="0"/>
-            </w:pPr>
             <w:r>
               <w:rPr>
-                <w:rFonts w:ascii="Calibri" w:hAnsi="Calibri"/>
-                <w:b/>
-                <w:sz w:val="16"/>
+                <w:color w:val="1E293B"/>
+                <w:sz w:val="19"/>
               </w:rPr>
               <w:t>Topic 5: DMA Working Protocol</w:t>
             </w:r>
@@ -818,23 +599,21 @@
         </w:tc>
         <w:tc>
           <w:tcPr>
-            <w:tcW w:type="dxa" w:w="1584"/>
-            <w:shd w:fill="FFFFFF"/>
+            <w:tcW w:type="dxa" w:w="2340"/>
+            <w:vAlign w:val="center"/>
             <w:tcMar>
-              <w:top w:w="70" w:type="dxa"/>
-              <w:bottom w:w="70" w:type="dxa"/>
-              <w:left w:w="80" w:type="dxa"/>
-              <w:right w:w="80" w:type="dxa"/>
+              <w:top w:w="120" w:type="dxa"/>
+              <w:bottom w:w="120" w:type="dxa"/>
+              <w:left w:w="150" w:type="dxa"/>
+              <w:right w:w="150" w:type="dxa"/>
             </w:tcMar>
+            <w:shd w:fill="F8FAFC"/>
           </w:tcPr>
           <w:p>
-            <w:pPr>
-              <w:spacing w:after="0"/>
-            </w:pPr>
             <w:r>
               <w:rPr>
-                <w:rFonts w:ascii="Calibri" w:hAnsi="Calibri"/>
-                <w:sz w:val="16"/>
+                <w:color w:val="1E293B"/>
+                <w:sz w:val="19"/>
               </w:rPr>
               <w:t>Slide 14</w:t>
             </w:r>
@@ -842,23 +621,21 @@
         </w:tc>
         <w:tc>
           <w:tcPr>
-            <w:tcW w:type="dxa" w:w="3456"/>
-            <w:shd w:fill="FFFFFF"/>
+            <w:tcW w:type="dxa" w:w="2340"/>
+            <w:vAlign w:val="center"/>
             <w:tcMar>
-              <w:top w:w="70" w:type="dxa"/>
-              <w:bottom w:w="70" w:type="dxa"/>
-              <w:left w:w="80" w:type="dxa"/>
-              <w:right w:w="80" w:type="dxa"/>
+              <w:top w:w="120" w:type="dxa"/>
+              <w:bottom w:w="120" w:type="dxa"/>
+              <w:left w:w="150" w:type="dxa"/>
+              <w:right w:w="150" w:type="dxa"/>
             </w:tcMar>
+            <w:shd w:fill="F8FAFC"/>
           </w:tcPr>
           <w:p>
-            <w:pPr>
-              <w:spacing w:after="0"/>
-            </w:pPr>
             <w:r>
               <w:rPr>
-                <w:rFonts w:ascii="Calibri" w:hAnsi="Calibri"/>
-                <w:sz w:val="16"/>
+                <w:color w:val="1E293B"/>
+                <w:sz w:val="19"/>
               </w:rPr>
               <w:t>6-Step Transfer Protocol, HOLD/HLDA Handshake, IRQ Interrupt</w:t>
             </w:r>
@@ -866,25 +643,23 @@
         </w:tc>
         <w:tc>
           <w:tcPr>
-            <w:tcW w:type="dxa" w:w="2160"/>
-            <w:shd w:fill="FFFFFF"/>
+            <w:tcW w:type="dxa" w:w="2340"/>
+            <w:vAlign w:val="center"/>
             <w:tcMar>
-              <w:top w:w="70" w:type="dxa"/>
-              <w:bottom w:w="70" w:type="dxa"/>
-              <w:left w:w="80" w:type="dxa"/>
-              <w:right w:w="80" w:type="dxa"/>
+              <w:top w:w="120" w:type="dxa"/>
+              <w:bottom w:w="120" w:type="dxa"/>
+              <w:left w:w="150" w:type="dxa"/>
+              <w:right w:w="150" w:type="dxa"/>
             </w:tcMar>
+            <w:shd w:fill="F8FAFC"/>
           </w:tcPr>
           <w:p>
-            <w:pPr>
-              <w:spacing w:after="0"/>
-            </w:pPr>
             <w:r>
               <w:rPr>
-                <w:rFonts w:ascii="Consolas" w:hAnsi="Consolas"/>
-                <w:sz w:val="15"/>
+                <w:color w:val="1E293B"/>
+                <w:sz w:val="19"/>
               </w:rPr>
-              <w:t>DmaSimulator.jsx</w:t>
+              <w:t>DmaSimulator.jsx &amp; standalone.html</w:t>
             </w:r>
           </w:p>
         </w:tc>
@@ -892,24 +667,21 @@
       <w:tr>
         <w:tc>
           <w:tcPr>
-            <w:tcW w:type="dxa" w:w="2592"/>
-            <w:shd w:fill="F8FAFC"/>
+            <w:tcW w:type="dxa" w:w="2340"/>
+            <w:vAlign w:val="center"/>
             <w:tcMar>
-              <w:top w:w="70" w:type="dxa"/>
-              <w:bottom w:w="70" w:type="dxa"/>
-              <w:left w:w="80" w:type="dxa"/>
-              <w:right w:w="80" w:type="dxa"/>
+              <w:top w:w="120" w:type="dxa"/>
+              <w:bottom w:w="120" w:type="dxa"/>
+              <w:left w:w="150" w:type="dxa"/>
+              <w:right w:w="150" w:type="dxa"/>
             </w:tcMar>
+            <w:shd w:fill="FFFFFF"/>
           </w:tcPr>
           <w:p>
-            <w:pPr>
-              <w:spacing w:after="0"/>
-            </w:pPr>
             <w:r>
               <w:rPr>
-                <w:rFonts w:ascii="Calibri" w:hAnsi="Calibri"/>
-                <w:b/>
-                <w:sz w:val="16"/>
+                <w:color w:val="1E293B"/>
+                <w:sz w:val="19"/>
               </w:rPr>
               <w:t>Topic 5: DMA Modes of Operation</w:t>
             </w:r>
@@ -917,23 +689,21 @@
         </w:tc>
         <w:tc>
           <w:tcPr>
-            <w:tcW w:type="dxa" w:w="1584"/>
-            <w:shd w:fill="F8FAFC"/>
+            <w:tcW w:type="dxa" w:w="2340"/>
+            <w:vAlign w:val="center"/>
             <w:tcMar>
-              <w:top w:w="70" w:type="dxa"/>
-              <w:bottom w:w="70" w:type="dxa"/>
-              <w:left w:w="80" w:type="dxa"/>
-              <w:right w:w="80" w:type="dxa"/>
+              <w:top w:w="120" w:type="dxa"/>
+              <w:bottom w:w="120" w:type="dxa"/>
+              <w:left w:w="150" w:type="dxa"/>
+              <w:right w:w="150" w:type="dxa"/>
             </w:tcMar>
+            <w:shd w:fill="FFFFFF"/>
           </w:tcPr>
           <w:p>
-            <w:pPr>
-              <w:spacing w:after="0"/>
-            </w:pPr>
             <w:r>
               <w:rPr>
-                <w:rFonts w:ascii="Calibri" w:hAnsi="Calibri"/>
-                <w:sz w:val="16"/>
+                <w:color w:val="1E293B"/>
+                <w:sz w:val="19"/>
               </w:rPr>
               <w:t>Slide 15</w:t>
             </w:r>
@@ -941,49 +711,45 @@
         </w:tc>
         <w:tc>
           <w:tcPr>
-            <w:tcW w:type="dxa" w:w="3456"/>
-            <w:shd w:fill="F8FAFC"/>
+            <w:tcW w:type="dxa" w:w="2340"/>
+            <w:vAlign w:val="center"/>
             <w:tcMar>
-              <w:top w:w="70" w:type="dxa"/>
-              <w:bottom w:w="70" w:type="dxa"/>
-              <w:left w:w="80" w:type="dxa"/>
-              <w:right w:w="80" w:type="dxa"/>
+              <w:top w:w="120" w:type="dxa"/>
+              <w:bottom w:w="120" w:type="dxa"/>
+              <w:left w:w="150" w:type="dxa"/>
+              <w:right w:w="150" w:type="dxa"/>
             </w:tcMar>
+            <w:shd w:fill="FFFFFF"/>
           </w:tcPr>
           <w:p>
-            <w:pPr>
-              <w:spacing w:after="0"/>
-            </w:pPr>
             <w:r>
               <w:rPr>
-                <w:rFonts w:ascii="Calibri" w:hAnsi="Calibri"/>
-                <w:sz w:val="16"/>
+                <w:color w:val="1E293B"/>
+                <w:sz w:val="19"/>
               </w:rPr>
-              <w:t>Burst Mode, Cycle Stealing Mode, Transparent Mode</w:t>
+              <w:t>Burst Mode, Cycle Stealing Mode, Transparent Mode Analysis</w:t>
             </w:r>
           </w:p>
         </w:tc>
         <w:tc>
           <w:tcPr>
-            <w:tcW w:type="dxa" w:w="2160"/>
-            <w:shd w:fill="F8FAFC"/>
+            <w:tcW w:type="dxa" w:w="2340"/>
+            <w:vAlign w:val="center"/>
             <w:tcMar>
-              <w:top w:w="70" w:type="dxa"/>
-              <w:bottom w:w="70" w:type="dxa"/>
-              <w:left w:w="80" w:type="dxa"/>
-              <w:right w:w="80" w:type="dxa"/>
+              <w:top w:w="120" w:type="dxa"/>
+              <w:bottom w:w="120" w:type="dxa"/>
+              <w:left w:w="150" w:type="dxa"/>
+              <w:right w:w="150" w:type="dxa"/>
             </w:tcMar>
+            <w:shd w:fill="FFFFFF"/>
           </w:tcPr>
           <w:p>
-            <w:pPr>
-              <w:spacing w:after="0"/>
-            </w:pPr>
             <w:r>
               <w:rPr>
-                <w:rFonts w:ascii="Consolas" w:hAnsi="Consolas"/>
-                <w:sz w:val="15"/>
+                <w:color w:val="1E293B"/>
+                <w:sz w:val="19"/>
               </w:rPr>
-              <w:t>DmaSimulator.jsx</w:t>
+              <w:t>DmaSimulator.jsx &amp; standalone.html</w:t>
             </w:r>
           </w:p>
         </w:tc>
@@ -991,24 +757,21 @@
       <w:tr>
         <w:tc>
           <w:tcPr>
-            <w:tcW w:type="dxa" w:w="2592"/>
-            <w:shd w:fill="FFFFFF"/>
+            <w:tcW w:type="dxa" w:w="2340"/>
+            <w:vAlign w:val="center"/>
             <w:tcMar>
-              <w:top w:w="70" w:type="dxa"/>
-              <w:bottom w:w="70" w:type="dxa"/>
-              <w:left w:w="80" w:type="dxa"/>
-              <w:right w:w="80" w:type="dxa"/>
+              <w:top w:w="120" w:type="dxa"/>
+              <w:bottom w:w="120" w:type="dxa"/>
+              <w:left w:w="150" w:type="dxa"/>
+              <w:right w:w="150" w:type="dxa"/>
             </w:tcMar>
+            <w:shd w:fill="F8FAFC"/>
           </w:tcPr>
           <w:p>
-            <w:pPr>
-              <w:spacing w:after="0"/>
-            </w:pPr>
             <w:r>
               <w:rPr>
-                <w:rFonts w:ascii="Calibri" w:hAnsi="Calibri"/>
-                <w:b/>
-                <w:sz w:val="16"/>
+                <w:color w:val="1E293B"/>
+                <w:sz w:val="19"/>
               </w:rPr>
               <w:t>Topic 6: Multicore Organization</w:t>
             </w:r>
@@ -1016,23 +779,21 @@
         </w:tc>
         <w:tc>
           <w:tcPr>
-            <w:tcW w:type="dxa" w:w="1584"/>
-            <w:shd w:fill="FFFFFF"/>
+            <w:tcW w:type="dxa" w:w="2340"/>
+            <w:vAlign w:val="center"/>
             <w:tcMar>
-              <w:top w:w="70" w:type="dxa"/>
-              <w:bottom w:w="70" w:type="dxa"/>
-              <w:left w:w="80" w:type="dxa"/>
-              <w:right w:w="80" w:type="dxa"/>
+              <w:top w:w="120" w:type="dxa"/>
+              <w:bottom w:w="120" w:type="dxa"/>
+              <w:left w:w="150" w:type="dxa"/>
+              <w:right w:w="150" w:type="dxa"/>
             </w:tcMar>
+            <w:shd w:fill="F8FAFC"/>
           </w:tcPr>
           <w:p>
-            <w:pPr>
-              <w:spacing w:after="0"/>
-            </w:pPr>
             <w:r>
               <w:rPr>
-                <w:rFonts w:ascii="Calibri" w:hAnsi="Calibri"/>
-                <w:sz w:val="16"/>
+                <w:color w:val="1E293B"/>
+                <w:sz w:val="19"/>
               </w:rPr>
               <w:t>Slides 16–17</w:t>
             </w:r>
@@ -1040,47 +801,43 @@
         </w:tc>
         <w:tc>
           <w:tcPr>
-            <w:tcW w:type="dxa" w:w="3456"/>
-            <w:shd w:fill="FFFFFF"/>
+            <w:tcW w:type="dxa" w:w="2340"/>
+            <w:vAlign w:val="center"/>
             <w:tcMar>
-              <w:top w:w="70" w:type="dxa"/>
-              <w:bottom w:w="70" w:type="dxa"/>
-              <w:left w:w="80" w:type="dxa"/>
-              <w:right w:w="80" w:type="dxa"/>
+              <w:top w:w="120" w:type="dxa"/>
+              <w:bottom w:w="120" w:type="dxa"/>
+              <w:left w:w="150" w:type="dxa"/>
+              <w:right w:w="150" w:type="dxa"/>
             </w:tcMar>
+            <w:shd w:fill="F8FAFC"/>
           </w:tcPr>
           <w:p>
-            <w:pPr>
-              <w:spacing w:after="0"/>
-            </w:pPr>
             <w:r>
               <w:rPr>
-                <w:rFonts w:ascii="Calibri" w:hAnsi="Calibri"/>
-                <w:sz w:val="16"/>
+                <w:color w:val="1E293B"/>
+                <w:sz w:val="19"/>
               </w:rPr>
-              <w:t>Single Silicon Die, Shared L3 Cache, Thermal Density, Inter-Core Latency</w:t>
+              <w:t>Single Silicon Die, Shared L3 Cache, Thermal Concentrated Heat</w:t>
             </w:r>
           </w:p>
         </w:tc>
         <w:tc>
           <w:tcPr>
-            <w:tcW w:type="dxa" w:w="2160"/>
-            <w:shd w:fill="FFFFFF"/>
+            <w:tcW w:type="dxa" w:w="2340"/>
+            <w:vAlign w:val="center"/>
             <w:tcMar>
-              <w:top w:w="70" w:type="dxa"/>
-              <w:bottom w:w="70" w:type="dxa"/>
-              <w:left w:w="80" w:type="dxa"/>
-              <w:right w:w="80" w:type="dxa"/>
+              <w:top w:w="120" w:type="dxa"/>
+              <w:bottom w:w="120" w:type="dxa"/>
+              <w:left w:w="150" w:type="dxa"/>
+              <w:right w:w="150" w:type="dxa"/>
             </w:tcMar>
+            <w:shd w:fill="F8FAFC"/>
           </w:tcPr>
           <w:p>
-            <w:pPr>
-              <w:spacing w:after="0"/>
-            </w:pPr>
             <w:r>
               <w:rPr>
-                <w:rFonts w:ascii="Consolas" w:hAnsi="Consolas"/>
-                <w:sz w:val="15"/>
+                <w:color w:val="1E293B"/>
+                <w:sz w:val="19"/>
               </w:rPr>
               <w:t>MultiArchitectureComparator.jsx</w:t>
             </w:r>
@@ -1090,24 +847,21 @@
       <w:tr>
         <w:tc>
           <w:tcPr>
-            <w:tcW w:type="dxa" w:w="2592"/>
-            <w:shd w:fill="F8FAFC"/>
+            <w:tcW w:type="dxa" w:w="2340"/>
+            <w:vAlign w:val="center"/>
             <w:tcMar>
-              <w:top w:w="70" w:type="dxa"/>
-              <w:bottom w:w="70" w:type="dxa"/>
-              <w:left w:w="80" w:type="dxa"/>
-              <w:right w:w="80" w:type="dxa"/>
+              <w:top w:w="120" w:type="dxa"/>
+              <w:bottom w:w="120" w:type="dxa"/>
+              <w:left w:w="150" w:type="dxa"/>
+              <w:right w:w="150" w:type="dxa"/>
             </w:tcMar>
+            <w:shd w:fill="FFFFFF"/>
           </w:tcPr>
           <w:p>
-            <w:pPr>
-              <w:spacing w:after="0"/>
-            </w:pPr>
             <w:r>
               <w:rPr>
-                <w:rFonts w:ascii="Calibri" w:hAnsi="Calibri"/>
-                <w:b/>
-                <w:sz w:val="16"/>
+                <w:color w:val="1E293B"/>
+                <w:sz w:val="19"/>
               </w:rPr>
               <w:t>Topic 6: Multiprocessor Organization</w:t>
             </w:r>
@@ -1115,73 +869,220 @@
         </w:tc>
         <w:tc>
           <w:tcPr>
-            <w:tcW w:type="dxa" w:w="1584"/>
-            <w:shd w:fill="F8FAFC"/>
+            <w:tcW w:type="dxa" w:w="2340"/>
+            <w:vAlign w:val="center"/>
             <w:tcMar>
-              <w:top w:w="70" w:type="dxa"/>
-              <w:bottom w:w="70" w:type="dxa"/>
-              <w:left w:w="80" w:type="dxa"/>
-              <w:right w:w="80" w:type="dxa"/>
+              <w:top w:w="120" w:type="dxa"/>
+              <w:bottom w:w="120" w:type="dxa"/>
+              <w:left w:w="150" w:type="dxa"/>
+              <w:right w:w="150" w:type="dxa"/>
             </w:tcMar>
+            <w:shd w:fill="FFFFFF"/>
           </w:tcPr>
           <w:p>
-            <w:pPr>
-              <w:spacing w:after="0"/>
-            </w:pPr>
             <w:r>
               <w:rPr>
-                <w:rFonts w:ascii="Calibri" w:hAnsi="Calibri"/>
-                <w:sz w:val="16"/>
+                <w:color w:val="1E293B"/>
+                <w:sz w:val="19"/>
               </w:rPr>
-              <w:t>Slides 18–19</w:t>
+              <w:t>Slides 18–20</w:t>
             </w:r>
           </w:p>
         </w:tc>
         <w:tc>
           <w:tcPr>
-            <w:tcW w:type="dxa" w:w="3456"/>
-            <w:shd w:fill="F8FAFC"/>
+            <w:tcW w:type="dxa" w:w="2340"/>
+            <w:vAlign w:val="center"/>
             <w:tcMar>
-              <w:top w:w="70" w:type="dxa"/>
-              <w:bottom w:w="70" w:type="dxa"/>
-              <w:left w:w="80" w:type="dxa"/>
-              <w:right w:w="80" w:type="dxa"/>
+              <w:top w:w="120" w:type="dxa"/>
+              <w:bottom w:w="120" w:type="dxa"/>
+              <w:left w:w="150" w:type="dxa"/>
+              <w:right w:w="150" w:type="dxa"/>
             </w:tcMar>
+            <w:shd w:fill="FFFFFF"/>
           </w:tcPr>
           <w:p>
-            <w:pPr>
-              <w:spacing w:after="0"/>
-            </w:pPr>
             <w:r>
               <w:rPr>
-                <w:rFonts w:ascii="Calibri" w:hAnsi="Calibri"/>
-                <w:sz w:val="16"/>
+                <w:color w:val="1E293B"/>
+                <w:sz w:val="19"/>
               </w:rPr>
-              <w:t>Multi-Socket Motherboard, System Bus Arbiter, SMP vs. Distributed RAM, Fault Isolation</w:t>
+              <w:t>Multi-Socket Motherboard, System Bus Arbiter, SMP vs. NUMA, Fault Isolation</w:t>
             </w:r>
           </w:p>
         </w:tc>
         <w:tc>
           <w:tcPr>
-            <w:tcW w:type="dxa" w:w="2160"/>
-            <w:shd w:fill="F8FAFC"/>
+            <w:tcW w:type="dxa" w:w="2340"/>
+            <w:vAlign w:val="center"/>
             <w:tcMar>
-              <w:top w:w="70" w:type="dxa"/>
-              <w:bottom w:w="70" w:type="dxa"/>
-              <w:left w:w="80" w:type="dxa"/>
-              <w:right w:w="80" w:type="dxa"/>
+              <w:top w:w="120" w:type="dxa"/>
+              <w:bottom w:w="120" w:type="dxa"/>
+              <w:left w:w="150" w:type="dxa"/>
+              <w:right w:w="150" w:type="dxa"/>
             </w:tcMar>
+            <w:shd w:fill="FFFFFF"/>
           </w:tcPr>
           <w:p>
-            <w:pPr>
-              <w:spacing w:after="0"/>
-            </w:pPr>
             <w:r>
               <w:rPr>
-                <w:rFonts w:ascii="Consolas" w:hAnsi="Consolas"/>
-                <w:sz w:val="15"/>
+                <w:color w:val="1E293B"/>
+                <w:sz w:val="19"/>
               </w:rPr>
               <w:t>MultiArchitectureComparator.jsx</w:t>
+            </w:r>
+          </w:p>
+        </w:tc>
+      </w:tr>
+    </w:tbl>
+    <w:p>
+      <w:pPr>
+        <w:pStyle w:val="Heading1"/>
+      </w:pPr>
+      <w:r>
+        <w:t>4. Theoretical Models &amp; Mathematical Cycle Proofs</w:t>
+      </w:r>
+    </w:p>
+    <w:p>
+      <w:pPr>
+        <w:pStyle w:val="Heading2"/>
+      </w:pPr>
+      <w:r>
+        <w:t>4.1 DMA Bus Handshake Protocol (Slide 14)</w:t>
+      </w:r>
+    </w:p>
+    <w:p>
+      <w:r>
+        <w:t>Under Programmed I/O without DMA, every byte transferred requires the CPU to execute a load-store instruction sequence, consuming significant execution bandwidth:</w:t>
+        <w:br/>
+        <w:t xml:space="preserve">    Time(CPU-IO) = N × (T_read_device + T_write_RAM + T_loop_overhead)</w:t>
+        <w:br/>
+        <w:br/>
+        <w:t>With DMA, the processor grants mastership of the address and data buses to the DMA Controller:</w:t>
+        <w:br/>
+        <w:t>1. Peripheral asserts DREQ (DMA Request) to DMA Controller.</w:t>
+        <w:br/>
+        <w:t>2. DMA Controller asserts HOLD to CPU.</w:t>
+        <w:br/>
+        <w:t>3. CPU finishes the current machine cycle and responds by asserting HLDA (Hold Acknowledge), tri-stating its bus pins.</w:t>
+        <w:br/>
+        <w:t>4. DMA Controller asserts DACK to the peripheral.</w:t>
+        <w:br/>
+        <w:t>5. Data bytes transfer directly from peripheral to DRAM across the system data bus via MEMW strobes.</w:t>
+        <w:br/>
+        <w:t>6. Upon block completion, DMA de-asserts HOLD and asserts an Interrupt Request (IRQ) to inform the OS kernel.</w:t>
+      </w:r>
+    </w:p>
+    <w:p>
+      <w:pPr>
+        <w:pStyle w:val="Heading2"/>
+      </w:pPr>
+      <w:r>
+        <w:t>4.2 Quantitative Mathematical Model of DMA Modes (Slide 15)</w:t>
+      </w:r>
+    </w:p>
+    <w:tbl>
+      <w:tblPr>
+        <w:tblW w:type="auto" w:w="0"/>
+        <w:jc w:val="center"/>
+        <w:tblLook w:firstColumn="1" w:firstRow="1" w:lastColumn="0" w:lastRow="0" w:noHBand="0" w:noVBand="1" w:val="04A0"/>
+      </w:tblPr>
+      <w:tblGrid>
+        <w:gridCol w:w="2340"/>
+        <w:gridCol w:w="2340"/>
+        <w:gridCol w:w="2340"/>
+        <w:gridCol w:w="2340"/>
+      </w:tblGrid>
+      <w:tr>
+        <w:tc>
+          <w:tcPr>
+            <w:tcW w:type="dxa" w:w="2340"/>
+            <w:vAlign w:val="center"/>
+            <w:tcMar>
+              <w:top w:w="120" w:type="dxa"/>
+              <w:bottom w:w="120" w:type="dxa"/>
+              <w:left w:w="150" w:type="dxa"/>
+              <w:right w:w="150" w:type="dxa"/>
+            </w:tcMar>
+            <w:shd w:fill="0052FF"/>
+          </w:tcPr>
+          <w:p>
+            <w:r>
+              <w:rPr>
+                <w:b/>
+                <w:color w:val="FFFFFF"/>
+                <w:sz w:val="20"/>
+              </w:rPr>
+              <w:t>DMA Mode</w:t>
+            </w:r>
+          </w:p>
+        </w:tc>
+        <w:tc>
+          <w:tcPr>
+            <w:tcW w:type="dxa" w:w="2340"/>
+            <w:vAlign w:val="center"/>
+            <w:tcMar>
+              <w:top w:w="120" w:type="dxa"/>
+              <w:bottom w:w="120" w:type="dxa"/>
+              <w:left w:w="150" w:type="dxa"/>
+              <w:right w:w="150" w:type="dxa"/>
+            </w:tcMar>
+            <w:shd w:fill="0052FF"/>
+          </w:tcPr>
+          <w:p>
+            <w:r>
+              <w:rPr>
+                <w:b/>
+                <w:color w:val="FFFFFF"/>
+                <w:sz w:val="20"/>
+              </w:rPr>
+              <w:t>Bus Acquisition Strategy</w:t>
+            </w:r>
+          </w:p>
+        </w:tc>
+        <w:tc>
+          <w:tcPr>
+            <w:tcW w:type="dxa" w:w="2340"/>
+            <w:vAlign w:val="center"/>
+            <w:tcMar>
+              <w:top w:w="120" w:type="dxa"/>
+              <w:bottom w:w="120" w:type="dxa"/>
+              <w:left w:w="150" w:type="dxa"/>
+              <w:right w:w="150" w:type="dxa"/>
+            </w:tcMar>
+            <w:shd w:fill="0052FF"/>
+          </w:tcPr>
+          <w:p>
+            <w:r>
+              <w:rPr>
+                <w:b/>
+                <w:color w:val="FFFFFF"/>
+                <w:sz w:val="20"/>
+              </w:rPr>
+              <w:t>CPU Stalled Cycles</w:t>
+            </w:r>
+          </w:p>
+        </w:tc>
+        <w:tc>
+          <w:tcPr>
+            <w:tcW w:type="dxa" w:w="2340"/>
+            <w:vAlign w:val="center"/>
+            <w:tcMar>
+              <w:top w:w="120" w:type="dxa"/>
+              <w:bottom w:w="120" w:type="dxa"/>
+              <w:left w:w="150" w:type="dxa"/>
+              <w:right w:w="150" w:type="dxa"/>
+            </w:tcMar>
+            <w:shd w:fill="0052FF"/>
+          </w:tcPr>
+          <w:p>
+            <w:r>
+              <w:rPr>
+                <w:b/>
+                <w:color w:val="FFFFFF"/>
+                <w:sz w:val="20"/>
+              </w:rPr>
+              <w:t>Optimal Use Case Scenario</w:t>
             </w:r>
           </w:p>
         </w:tc>
@@ -1189,98 +1090,89 @@
       <w:tr>
         <w:tc>
           <w:tcPr>
-            <w:tcW w:type="dxa" w:w="2592"/>
+            <w:tcW w:type="dxa" w:w="2340"/>
+            <w:vAlign w:val="center"/>
+            <w:tcMar>
+              <w:top w:w="120" w:type="dxa"/>
+              <w:bottom w:w="120" w:type="dxa"/>
+              <w:left w:w="150" w:type="dxa"/>
+              <w:right w:w="150" w:type="dxa"/>
+            </w:tcMar>
             <w:shd w:fill="FFFFFF"/>
-            <w:tcMar>
-              <w:top w:w="70" w:type="dxa"/>
-              <w:bottom w:w="70" w:type="dxa"/>
-              <w:left w:w="80" w:type="dxa"/>
-              <w:right w:w="80" w:type="dxa"/>
-            </w:tcMar>
           </w:tcPr>
           <w:p>
-            <w:pPr>
-              <w:spacing w:after="0"/>
-            </w:pPr>
             <w:r>
               <w:rPr>
-                <w:rFonts w:ascii="Calibri" w:hAnsi="Calibri"/>
-                <w:b/>
-                <w:sz w:val="16"/>
+                <w:color w:val="1E293B"/>
+                <w:sz w:val="19"/>
               </w:rPr>
-              <w:t>Hardware Bus Crossroads</w:t>
+              <w:t>Burst Mode</w:t>
             </w:r>
           </w:p>
         </w:tc>
         <w:tc>
           <w:tcPr>
-            <w:tcW w:type="dxa" w:w="1584"/>
+            <w:tcW w:type="dxa" w:w="2340"/>
+            <w:vAlign w:val="center"/>
+            <w:tcMar>
+              <w:top w:w="120" w:type="dxa"/>
+              <w:bottom w:w="120" w:type="dxa"/>
+              <w:left w:w="150" w:type="dxa"/>
+              <w:right w:w="150" w:type="dxa"/>
+            </w:tcMar>
             <w:shd w:fill="FFFFFF"/>
-            <w:tcMar>
-              <w:top w:w="70" w:type="dxa"/>
-              <w:bottom w:w="70" w:type="dxa"/>
-              <w:left w:w="80" w:type="dxa"/>
-              <w:right w:w="80" w:type="dxa"/>
-            </w:tcMar>
           </w:tcPr>
           <w:p>
-            <w:pPr>
-              <w:spacing w:after="0"/>
-            </w:pPr>
             <w:r>
               <w:rPr>
-                <w:rFonts w:ascii="Calibri" w:hAnsi="Calibri"/>
-                <w:sz w:val="16"/>
+                <w:color w:val="1E293B"/>
+                <w:sz w:val="19"/>
               </w:rPr>
-              <w:t>Slides 18–19</w:t>
+              <w:t>Continuous block lock until all N bytes are transferred</w:t>
             </w:r>
           </w:p>
         </w:tc>
         <w:tc>
           <w:tcPr>
-            <w:tcW w:type="dxa" w:w="3456"/>
+            <w:tcW w:type="dxa" w:w="2340"/>
+            <w:vAlign w:val="center"/>
+            <w:tcMar>
+              <w:top w:w="120" w:type="dxa"/>
+              <w:bottom w:w="120" w:type="dxa"/>
+              <w:left w:w="150" w:type="dxa"/>
+              <w:right w:w="150" w:type="dxa"/>
+            </w:tcMar>
             <w:shd w:fill="FFFFFF"/>
-            <w:tcMar>
-              <w:top w:w="70" w:type="dxa"/>
-              <w:bottom w:w="70" w:type="dxa"/>
-              <w:left w:w="80" w:type="dxa"/>
-              <w:right w:w="80" w:type="dxa"/>
-            </w:tcMar>
           </w:tcPr>
           <w:p>
-            <w:pPr>
-              <w:spacing w:after="0"/>
-            </w:pPr>
             <w:r>
               <w:rPr>
-                <w:rFonts w:ascii="Calibri" w:hAnsi="Calibri"/>
-                <w:sz w:val="16"/>
+                <w:color w:val="1E293B"/>
+                <w:sz w:val="19"/>
               </w:rPr>
-              <w:t>Memory Bus Contention, Arbiter Turnstile, Starvation Prevention</w:t>
+              <w:t>100% of transfer window (N cycles)</w:t>
             </w:r>
           </w:p>
         </w:tc>
         <w:tc>
           <w:tcPr>
-            <w:tcW w:type="dxa" w:w="2160"/>
+            <w:tcW w:type="dxa" w:w="2340"/>
+            <w:vAlign w:val="center"/>
+            <w:tcMar>
+              <w:top w:w="120" w:type="dxa"/>
+              <w:bottom w:w="120" w:type="dxa"/>
+              <w:left w:w="150" w:type="dxa"/>
+              <w:right w:w="150" w:type="dxa"/>
+            </w:tcMar>
             <w:shd w:fill="FFFFFF"/>
-            <w:tcMar>
-              <w:top w:w="70" w:type="dxa"/>
-              <w:bottom w:w="70" w:type="dxa"/>
-              <w:left w:w="80" w:type="dxa"/>
-              <w:right w:w="80" w:type="dxa"/>
-            </w:tcMar>
           </w:tcPr>
           <w:p>
-            <w:pPr>
-              <w:spacing w:after="0"/>
-            </w:pPr>
             <w:r>
               <w:rPr>
-                <w:rFonts w:ascii="Consolas" w:hAnsi="Consolas"/>
-                <w:sz w:val="15"/>
+                <w:color w:val="1E293B"/>
+                <w:sz w:val="19"/>
               </w:rPr>
-              <w:t>UnifiedSystemLab.jsx</w:t>
+              <w:t>Large contiguous disk/NVMe blocks; high bulk throughput</w:t>
             </w:r>
           </w:p>
         </w:tc>
@@ -1288,98 +1180,179 @@
       <w:tr>
         <w:tc>
           <w:tcPr>
-            <w:tcW w:type="dxa" w:w="2592"/>
+            <w:tcW w:type="dxa" w:w="2340"/>
+            <w:vAlign w:val="center"/>
+            <w:tcMar>
+              <w:top w:w="120" w:type="dxa"/>
+              <w:bottom w:w="120" w:type="dxa"/>
+              <w:left w:w="150" w:type="dxa"/>
+              <w:right w:w="150" w:type="dxa"/>
+            </w:tcMar>
             <w:shd w:fill="F8FAFC"/>
-            <w:tcMar>
-              <w:top w:w="70" w:type="dxa"/>
-              <w:bottom w:w="70" w:type="dxa"/>
-              <w:left w:w="80" w:type="dxa"/>
-              <w:right w:w="80" w:type="dxa"/>
-            </w:tcMar>
           </w:tcPr>
           <w:p>
-            <w:pPr>
-              <w:spacing w:after="0"/>
-            </w:pPr>
             <w:r>
               <w:rPr>
-                <w:rFonts w:ascii="Calibri" w:hAnsi="Calibri"/>
-                <w:b/>
-                <w:sz w:val="16"/>
+                <w:color w:val="1E293B"/>
+                <w:sz w:val="19"/>
               </w:rPr>
-              <w:t>OS Historical Generations</w:t>
+              <w:t>Cycle Stealing</w:t>
             </w:r>
           </w:p>
         </w:tc>
         <w:tc>
           <w:tcPr>
-            <w:tcW w:type="dxa" w:w="1584"/>
+            <w:tcW w:type="dxa" w:w="2340"/>
+            <w:vAlign w:val="center"/>
+            <w:tcMar>
+              <w:top w:w="120" w:type="dxa"/>
+              <w:bottom w:w="120" w:type="dxa"/>
+              <w:left w:w="150" w:type="dxa"/>
+              <w:right w:w="150" w:type="dxa"/>
+            </w:tcMar>
             <w:shd w:fill="F8FAFC"/>
-            <w:tcMar>
-              <w:top w:w="70" w:type="dxa"/>
-              <w:bottom w:w="70" w:type="dxa"/>
-              <w:left w:w="80" w:type="dxa"/>
-              <w:right w:w="80" w:type="dxa"/>
-            </w:tcMar>
           </w:tcPr>
           <w:p>
-            <w:pPr>
-              <w:spacing w:after="0"/>
-            </w:pPr>
             <w:r>
               <w:rPr>
-                <w:rFonts w:ascii="Calibri" w:hAnsi="Calibri"/>
-                <w:sz w:val="16"/>
+                <w:color w:val="1E293B"/>
+                <w:sz w:val="19"/>
               </w:rPr>
-              <w:t>Slides 23, 35–39</w:t>
+              <w:t>Interleaves 1 bus cycle for 1 byte, yields 1 cycle to CPU</w:t>
             </w:r>
           </w:p>
         </w:tc>
         <w:tc>
           <w:tcPr>
-            <w:tcW w:type="dxa" w:w="3456"/>
+            <w:tcW w:type="dxa" w:w="2340"/>
+            <w:vAlign w:val="center"/>
+            <w:tcMar>
+              <w:top w:w="120" w:type="dxa"/>
+              <w:bottom w:w="120" w:type="dxa"/>
+              <w:left w:w="150" w:type="dxa"/>
+              <w:right w:w="150" w:type="dxa"/>
+            </w:tcMar>
             <w:shd w:fill="F8FAFC"/>
-            <w:tcMar>
-              <w:top w:w="70" w:type="dxa"/>
-              <w:bottom w:w="70" w:type="dxa"/>
-              <w:left w:w="80" w:type="dxa"/>
-              <w:right w:w="80" w:type="dxa"/>
-            </w:tcMar>
           </w:tcPr>
           <w:p>
-            <w:pPr>
-              <w:spacing w:after="0"/>
-            </w:pPr>
             <w:r>
               <w:rPr>
-                <w:rFonts w:ascii="Calibri" w:hAnsi="Calibri"/>
-                <w:sz w:val="16"/>
+                <w:color w:val="1E293B"/>
+                <w:sz w:val="19"/>
               </w:rPr>
-              <w:t>1st to 5th Gen OS, Programmed I/O vs. Batch vs. DMA vs. Multicore</w:t>
+              <w:t>50% of transfer window (N out of 2N cycles)</w:t>
             </w:r>
           </w:p>
         </w:tc>
         <w:tc>
           <w:tcPr>
-            <w:tcW w:type="dxa" w:w="2160"/>
+            <w:tcW w:type="dxa" w:w="2340"/>
+            <w:vAlign w:val="center"/>
+            <w:tcMar>
+              <w:top w:w="120" w:type="dxa"/>
+              <w:bottom w:w="120" w:type="dxa"/>
+              <w:left w:w="150" w:type="dxa"/>
+              <w:right w:w="150" w:type="dxa"/>
+            </w:tcMar>
             <w:shd w:fill="F8FAFC"/>
-            <w:tcMar>
-              <w:top w:w="70" w:type="dxa"/>
-              <w:bottom w:w="70" w:type="dxa"/>
-              <w:left w:w="80" w:type="dxa"/>
-              <w:right w:w="80" w:type="dxa"/>
-            </w:tcMar>
           </w:tcPr>
           <w:p>
-            <w:pPr>
-              <w:spacing w:after="0"/>
-            </w:pPr>
             <w:r>
               <w:rPr>
-                <w:rFonts w:ascii="Consolas" w:hAnsi="Consolas"/>
-                <w:sz w:val="15"/>
+                <w:color w:val="1E293B"/>
+                <w:sz w:val="19"/>
               </w:rPr>
-              <w:t>OsEvolutionTimeMachine.jsx</w:t>
+              <w:t>Interactive systems; eliminates CPU starvation</w:t>
+            </w:r>
+          </w:p>
+        </w:tc>
+      </w:tr>
+      <w:tr>
+        <w:tc>
+          <w:tcPr>
+            <w:tcW w:type="dxa" w:w="2340"/>
+            <w:vAlign w:val="center"/>
+            <w:tcMar>
+              <w:top w:w="120" w:type="dxa"/>
+              <w:bottom w:w="120" w:type="dxa"/>
+              <w:left w:w="150" w:type="dxa"/>
+              <w:right w:w="150" w:type="dxa"/>
+            </w:tcMar>
+            <w:shd w:fill="FFFFFF"/>
+          </w:tcPr>
+          <w:p>
+            <w:r>
+              <w:rPr>
+                <w:color w:val="1E293B"/>
+                <w:sz w:val="19"/>
+              </w:rPr>
+              <w:t>Transparent Mode</w:t>
+            </w:r>
+          </w:p>
+        </w:tc>
+        <w:tc>
+          <w:tcPr>
+            <w:tcW w:type="dxa" w:w="2340"/>
+            <w:vAlign w:val="center"/>
+            <w:tcMar>
+              <w:top w:w="120" w:type="dxa"/>
+              <w:bottom w:w="120" w:type="dxa"/>
+              <w:left w:w="150" w:type="dxa"/>
+              <w:right w:w="150" w:type="dxa"/>
+            </w:tcMar>
+            <w:shd w:fill="FFFFFF"/>
+          </w:tcPr>
+          <w:p>
+            <w:r>
+              <w:rPr>
+                <w:color w:val="1E293B"/>
+                <w:sz w:val="19"/>
+              </w:rPr>
+              <w:t>Monitors CPU decode; claims bus only during ALU execution</w:t>
+            </w:r>
+          </w:p>
+        </w:tc>
+        <w:tc>
+          <w:tcPr>
+            <w:tcW w:type="dxa" w:w="2340"/>
+            <w:vAlign w:val="center"/>
+            <w:tcMar>
+              <w:top w:w="120" w:type="dxa"/>
+              <w:bottom w:w="120" w:type="dxa"/>
+              <w:left w:w="150" w:type="dxa"/>
+              <w:right w:w="150" w:type="dxa"/>
+            </w:tcMar>
+            <w:shd w:fill="FFFFFF"/>
+          </w:tcPr>
+          <w:p>
+            <w:r>
+              <w:rPr>
+                <w:color w:val="1E293B"/>
+                <w:sz w:val="19"/>
+              </w:rPr>
+              <w:t>0% (Zero CPU wait states)</w:t>
+            </w:r>
+          </w:p>
+        </w:tc>
+        <w:tc>
+          <w:tcPr>
+            <w:tcW w:type="dxa" w:w="2340"/>
+            <w:vAlign w:val="center"/>
+            <w:tcMar>
+              <w:top w:w="120" w:type="dxa"/>
+              <w:bottom w:w="120" w:type="dxa"/>
+              <w:left w:w="150" w:type="dxa"/>
+              <w:right w:w="150" w:type="dxa"/>
+            </w:tcMar>
+            <w:shd w:fill="FFFFFF"/>
+          </w:tcPr>
+          <w:p>
+            <w:r>
+              <w:rPr>
+                <w:color w:val="1E293B"/>
+                <w:sz w:val="19"/>
+              </w:rPr>
+              <w:t>High-priority compute kernels; zero execution penalty</w:t>
             </w:r>
           </w:p>
         </w:tc>
@@ -1387,50 +1360,48 @@
     </w:tbl>
     <w:p>
       <w:pPr>
-        <w:spacing w:after="120"/>
+        <w:pStyle w:val="Heading2"/>
       </w:pPr>
+      <w:r>
+        <w:t>4.3 Multicore vs. Multiprocessor Latency &amp; Reliability Proofs</w:t>
+      </w:r>
     </w:p>
     <w:p>
-      <w:pPr>
-        <w:keepNext/>
-        <w:spacing w:before="320" w:after="120"/>
-      </w:pPr>
       <w:r>
-        <w:rPr>
-          <w:rFonts w:ascii="Calibri" w:hAnsi="Calibri"/>
-          <w:b/>
-          <w:color w:val="0F172A"/>
-          <w:sz w:val="27"/>
-        </w:rPr>
-        <w:t>3. Theoretical Foundations &amp; Mathematical Cycle Models</w:t>
+        <w:t>Memory Access Latency Proof:</w:t>
+        <w:br/>
+        <w:t>In Multicore architectures sharing on-die L3 cache:</w:t>
+        <w:br/>
+        <w:t xml:space="preserve">    T_access(Multicore) = T_L1/L2 + P_miss × T_on-chip_L3 ≈ 0.8 ns to 2.2 ns</w:t>
+        <w:br/>
+        <w:br/>
+        <w:t>In Symmetric Multiprocessors (SMP) communicating over an external motherboard bus:</w:t>
+        <w:br/>
+        <w:t xml:space="preserve">    T_access(Multiprocessor) = T_L1/L2 + P_miss × (T_socket_egress + T_bus_arbitration + T_motherboard_trace + T_DRAM_controller) ≈ 15 ns to 65 ns</w:t>
+        <w:br/>
+        <w:br/>
+        <w:t>Because 0.8 ns ≪ 65 ns, this proves Slide 20: 'Multicore is faster in executing a single multi-threaded program' due to direct on-chip cache memory communication with zero external bus serialization.</w:t>
+        <w:br/>
+        <w:br/>
+        <w:t>Fault Tolerance Proof:</w:t>
+        <w:br/>
+        <w:t>Let p be the probability of a physical die breakdown due to thermal hotspot density. In Multicore, all cores reside on one die: P(System Failure) = p (single point of failure). In Multiprocessors with k independent sockets: P(System Failure) = p^k. If one processor fails, the remaining sockets absorb the processes, proving Slide 19: 'High fault tolerance'.</w:t>
       </w:r>
     </w:p>
     <w:p>
       <w:pPr>
-        <w:keepNext/>
-        <w:spacing w:before="240" w:after="80"/>
+        <w:pStyle w:val="Heading1"/>
       </w:pPr>
       <w:r>
-        <w:rPr>
-          <w:rFonts w:ascii="Calibri" w:hAnsi="Calibri"/>
-          <w:b/>
-          <w:color w:val="2563EB"/>
-          <w:sz w:val="22"/>
-        </w:rPr>
-        <w:t>3.1 Direct Memory Access (DMA) Protocol &amp; Handshake (Slide 14)</w:t>
+        <w:t>5. Experimental Verification &amp; Test Results</w:t>
       </w:r>
     </w:p>
     <w:p>
       <w:pPr>
-        <w:spacing w:after="120" w:line="276" w:lineRule="auto"/>
+        <w:pStyle w:val="Heading2"/>
       </w:pPr>
       <w:r>
-        <w:rPr>
-          <w:rFonts w:ascii="Calibri" w:hAnsi="Calibri"/>
-          <w:color w:val="1E293B"/>
-          <w:sz w:val="19"/>
-        </w:rPr>
-        <w:t>Under Programmed I/O without DMA, every byte requires CPU execution: Time_CPU-IO = N × (T_read + T_write + T_branch). DMA bypasses the processor through a formal 6-step hardware handshake granting direct bus mastership:</w:t>
+        <w:t>Test Case 1: 24-Cycle DMA Mode Analysis</w:t>
       </w:r>
     </w:p>
     <w:tbl>
@@ -1438,59 +1409,463 @@
         <w:tblW w:type="auto" w:w="0"/>
         <w:jc w:val="center"/>
         <w:tblLook w:firstColumn="1" w:firstRow="1" w:lastColumn="0" w:lastRow="0" w:noHBand="0" w:noVBand="1" w:val="04A0"/>
-        <w:tblBorders>
-          <w:top w:val="single" w:sz="4" w:space="0" w:color="1E293B"/>
-          <w:left w:val="single" w:sz="4" w:space="0" w:color="1E293B"/>
-          <w:bottom w:val="single" w:sz="4" w:space="0" w:color="1E293B"/>
-          <w:right w:val="single" w:sz="4" w:space="0" w:color="1E293B"/>
-          <w:insideH w:val="single" w:sz="4" w:space="0" w:color="1E293B"/>
-          <w:insideV w:val="single" w:sz="4" w:space="0" w:color="1E293B"/>
-        </w:tblBorders>
       </w:tblPr>
       <w:tblGrid>
-        <w:gridCol w:w="9936"/>
+        <w:gridCol w:w="1872"/>
+        <w:gridCol w:w="1872"/>
+        <w:gridCol w:w="1872"/>
+        <w:gridCol w:w="1872"/>
+        <w:gridCol w:w="1872"/>
       </w:tblGrid>
       <w:tr>
         <w:tc>
           <w:tcPr>
-            <w:tcW w:type="dxa" w:w="9792"/>
-            <w:shd w:fill="0F172A"/>
+            <w:tcW w:type="dxa" w:w="1872"/>
+            <w:vAlign w:val="center"/>
             <w:tcMar>
-              <w:top w:w="80" w:type="dxa"/>
-              <w:bottom w:w="80" w:type="dxa"/>
-              <w:left w:w="120" w:type="dxa"/>
-              <w:right w:w="120" w:type="dxa"/>
+              <w:top w:w="120" w:type="dxa"/>
+              <w:bottom w:w="120" w:type="dxa"/>
+              <w:left w:w="150" w:type="dxa"/>
+              <w:right w:w="150" w:type="dxa"/>
             </w:tcMar>
+            <w:shd w:fill="0052FF"/>
           </w:tcPr>
           <w:p>
-            <w:pPr>
-              <w:spacing w:after="0"/>
-            </w:pPr>
             <w:r>
               <w:rPr>
-                <w:rFonts w:ascii="Consolas" w:hAnsi="Consolas"/>
-                <w:color w:val="F8FAFC"/>
-                <w:sz w:val="17"/>
+                <w:b/>
+                <w:color w:val="FFFFFF"/>
+                <w:sz w:val="20"/>
               </w:rPr>
-              <w:t>+-----------------------------------------------------------------------------------+</w:t>
-              <w:br/>
-              <w:t>|                     6-STEP DMA PROTOCOL &amp; BUS ARBITRATION                         |</w:t>
-              <w:br/>
-              <w:t>+-----------------------------------------------------------------------------------+</w:t>
-              <w:br/>
-              <w:t>| Step 1: Peripheral asserts DREQ (DMA Request) to DMA Controller                   |</w:t>
-              <w:br/>
-              <w:t>| Step 2: DMA Controller asserts HOLD (Bus Request) line to the CPU                 |</w:t>
-              <w:br/>
-              <w:t>| Step 3: CPU finishes current machine cycle, tri-states buses, asserts HLDA        |</w:t>
-              <w:br/>
-              <w:t>| Step 4: DMA Controller takes mastership of System Bus, asserts DACK to Peripheral |</w:t>
-              <w:br/>
-              <w:t>| Step 5: High-speed burst data transfer occurs directly between NVMe/Disk and RAM  |</w:t>
-              <w:br/>
-              <w:t>| Step 6: DMA deasserts HOLD and issues Interrupt (IRQ) signal; CPU resumes process |</w:t>
-              <w:br/>
-              <w:t>+-----------------------------------------------------------------------------------+</w:t>
+              <w:t>DMA Mode</w:t>
+            </w:r>
+          </w:p>
+        </w:tc>
+        <w:tc>
+          <w:tcPr>
+            <w:tcW w:type="dxa" w:w="1872"/>
+            <w:vAlign w:val="center"/>
+            <w:tcMar>
+              <w:top w:w="120" w:type="dxa"/>
+              <w:bottom w:w="120" w:type="dxa"/>
+              <w:left w:w="150" w:type="dxa"/>
+              <w:right w:w="150" w:type="dxa"/>
+            </w:tcMar>
+            <w:shd w:fill="0052FF"/>
+          </w:tcPr>
+          <w:p>
+            <w:r>
+              <w:rPr>
+                <w:b/>
+                <w:color w:val="FFFFFF"/>
+                <w:sz w:val="20"/>
+              </w:rPr>
+              <w:t>Transfer Size</w:t>
+            </w:r>
+          </w:p>
+        </w:tc>
+        <w:tc>
+          <w:tcPr>
+            <w:tcW w:type="dxa" w:w="1872"/>
+            <w:vAlign w:val="center"/>
+            <w:tcMar>
+              <w:top w:w="120" w:type="dxa"/>
+              <w:bottom w:w="120" w:type="dxa"/>
+              <w:left w:w="150" w:type="dxa"/>
+              <w:right w:w="150" w:type="dxa"/>
+            </w:tcMar>
+            <w:shd w:fill="0052FF"/>
+          </w:tcPr>
+          <w:p>
+            <w:r>
+              <w:rPr>
+                <w:b/>
+                <w:color w:val="FFFFFF"/>
+                <w:sz w:val="20"/>
+              </w:rPr>
+              <w:t>CPU Active Cycles</w:t>
+            </w:r>
+          </w:p>
+        </w:tc>
+        <w:tc>
+          <w:tcPr>
+            <w:tcW w:type="dxa" w:w="1872"/>
+            <w:vAlign w:val="center"/>
+            <w:tcMar>
+              <w:top w:w="120" w:type="dxa"/>
+              <w:bottom w:w="120" w:type="dxa"/>
+              <w:left w:w="150" w:type="dxa"/>
+              <w:right w:w="150" w:type="dxa"/>
+            </w:tcMar>
+            <w:shd w:fill="0052FF"/>
+          </w:tcPr>
+          <w:p>
+            <w:r>
+              <w:rPr>
+                <w:b/>
+                <w:color w:val="FFFFFF"/>
+                <w:sz w:val="20"/>
+              </w:rPr>
+              <w:t>CPU Stalled Cycles</w:t>
+            </w:r>
+          </w:p>
+        </w:tc>
+        <w:tc>
+          <w:tcPr>
+            <w:tcW w:type="dxa" w:w="1872"/>
+            <w:vAlign w:val="center"/>
+            <w:tcMar>
+              <w:top w:w="120" w:type="dxa"/>
+              <w:bottom w:w="120" w:type="dxa"/>
+              <w:left w:w="150" w:type="dxa"/>
+              <w:right w:w="150" w:type="dxa"/>
+            </w:tcMar>
+            <w:shd w:fill="0052FF"/>
+          </w:tcPr>
+          <w:p>
+            <w:r>
+              <w:rPr>
+                <w:b/>
+                <w:color w:val="FFFFFF"/>
+                <w:sz w:val="20"/>
+              </w:rPr>
+              <w:t>CPU Utilization</w:t>
+            </w:r>
+          </w:p>
+        </w:tc>
+      </w:tr>
+      <w:tr>
+        <w:tc>
+          <w:tcPr>
+            <w:tcW w:type="dxa" w:w="1872"/>
+            <w:vAlign w:val="center"/>
+            <w:tcMar>
+              <w:top w:w="120" w:type="dxa"/>
+              <w:bottom w:w="120" w:type="dxa"/>
+              <w:left w:w="150" w:type="dxa"/>
+              <w:right w:w="150" w:type="dxa"/>
+            </w:tcMar>
+            <w:shd w:fill="FFFFFF"/>
+          </w:tcPr>
+          <w:p>
+            <w:r>
+              <w:rPr>
+                <w:color w:val="1E293B"/>
+                <w:sz w:val="19"/>
+              </w:rPr>
+              <w:t>Burst Mode</w:t>
+            </w:r>
+          </w:p>
+        </w:tc>
+        <w:tc>
+          <w:tcPr>
+            <w:tcW w:type="dxa" w:w="1872"/>
+            <w:vAlign w:val="center"/>
+            <w:tcMar>
+              <w:top w:w="120" w:type="dxa"/>
+              <w:bottom w:w="120" w:type="dxa"/>
+              <w:left w:w="150" w:type="dxa"/>
+              <w:right w:w="150" w:type="dxa"/>
+            </w:tcMar>
+            <w:shd w:fill="FFFFFF"/>
+          </w:tcPr>
+          <w:p>
+            <w:r>
+              <w:rPr>
+                <w:color w:val="1E293B"/>
+                <w:sz w:val="19"/>
+              </w:rPr>
+              <w:t>16 Bytes</w:t>
+            </w:r>
+          </w:p>
+        </w:tc>
+        <w:tc>
+          <w:tcPr>
+            <w:tcW w:type="dxa" w:w="1872"/>
+            <w:vAlign w:val="center"/>
+            <w:tcMar>
+              <w:top w:w="120" w:type="dxa"/>
+              <w:bottom w:w="120" w:type="dxa"/>
+              <w:left w:w="150" w:type="dxa"/>
+              <w:right w:w="150" w:type="dxa"/>
+            </w:tcMar>
+            <w:shd w:fill="FFFFFF"/>
+          </w:tcPr>
+          <w:p>
+            <w:r>
+              <w:rPr>
+                <w:color w:val="1E293B"/>
+                <w:sz w:val="19"/>
+              </w:rPr>
+              <w:t>0 Cycles</w:t>
+            </w:r>
+          </w:p>
+        </w:tc>
+        <w:tc>
+          <w:tcPr>
+            <w:tcW w:type="dxa" w:w="1872"/>
+            <w:vAlign w:val="center"/>
+            <w:tcMar>
+              <w:top w:w="120" w:type="dxa"/>
+              <w:bottom w:w="120" w:type="dxa"/>
+              <w:left w:w="150" w:type="dxa"/>
+              <w:right w:w="150" w:type="dxa"/>
+            </w:tcMar>
+            <w:shd w:fill="FFFFFF"/>
+          </w:tcPr>
+          <w:p>
+            <w:r>
+              <w:rPr>
+                <w:color w:val="1E293B"/>
+                <w:sz w:val="19"/>
+              </w:rPr>
+              <w:t>16 Cycles</w:t>
+            </w:r>
+          </w:p>
+        </w:tc>
+        <w:tc>
+          <w:tcPr>
+            <w:tcW w:type="dxa" w:w="1872"/>
+            <w:vAlign w:val="center"/>
+            <w:tcMar>
+              <w:top w:w="120" w:type="dxa"/>
+              <w:bottom w:w="120" w:type="dxa"/>
+              <w:left w:w="150" w:type="dxa"/>
+              <w:right w:w="150" w:type="dxa"/>
+            </w:tcMar>
+            <w:shd w:fill="FFFFFF"/>
+          </w:tcPr>
+          <w:p>
+            <w:r>
+              <w:rPr>
+                <w:color w:val="1E293B"/>
+                <w:sz w:val="19"/>
+              </w:rPr>
+              <w:t>0% (Complete Stall)</w:t>
+            </w:r>
+          </w:p>
+        </w:tc>
+      </w:tr>
+      <w:tr>
+        <w:tc>
+          <w:tcPr>
+            <w:tcW w:type="dxa" w:w="1872"/>
+            <w:vAlign w:val="center"/>
+            <w:tcMar>
+              <w:top w:w="120" w:type="dxa"/>
+              <w:bottom w:w="120" w:type="dxa"/>
+              <w:left w:w="150" w:type="dxa"/>
+              <w:right w:w="150" w:type="dxa"/>
+            </w:tcMar>
+            <w:shd w:fill="F8FAFC"/>
+          </w:tcPr>
+          <w:p>
+            <w:r>
+              <w:rPr>
+                <w:color w:val="1E293B"/>
+                <w:sz w:val="19"/>
+              </w:rPr>
+              <w:t>Cycle Stealing</w:t>
+            </w:r>
+          </w:p>
+        </w:tc>
+        <w:tc>
+          <w:tcPr>
+            <w:tcW w:type="dxa" w:w="1872"/>
+            <w:vAlign w:val="center"/>
+            <w:tcMar>
+              <w:top w:w="120" w:type="dxa"/>
+              <w:bottom w:w="120" w:type="dxa"/>
+              <w:left w:w="150" w:type="dxa"/>
+              <w:right w:w="150" w:type="dxa"/>
+            </w:tcMar>
+            <w:shd w:fill="F8FAFC"/>
+          </w:tcPr>
+          <w:p>
+            <w:r>
+              <w:rPr>
+                <w:color w:val="1E293B"/>
+                <w:sz w:val="19"/>
+              </w:rPr>
+              <w:t>16 Bytes</w:t>
+            </w:r>
+          </w:p>
+        </w:tc>
+        <w:tc>
+          <w:tcPr>
+            <w:tcW w:type="dxa" w:w="1872"/>
+            <w:vAlign w:val="center"/>
+            <w:tcMar>
+              <w:top w:w="120" w:type="dxa"/>
+              <w:bottom w:w="120" w:type="dxa"/>
+              <w:left w:w="150" w:type="dxa"/>
+              <w:right w:w="150" w:type="dxa"/>
+            </w:tcMar>
+            <w:shd w:fill="F8FAFC"/>
+          </w:tcPr>
+          <w:p>
+            <w:r>
+              <w:rPr>
+                <w:color w:val="1E293B"/>
+                <w:sz w:val="19"/>
+              </w:rPr>
+              <w:t>16 Cycles</w:t>
+            </w:r>
+          </w:p>
+        </w:tc>
+        <w:tc>
+          <w:tcPr>
+            <w:tcW w:type="dxa" w:w="1872"/>
+            <w:vAlign w:val="center"/>
+            <w:tcMar>
+              <w:top w:w="120" w:type="dxa"/>
+              <w:bottom w:w="120" w:type="dxa"/>
+              <w:left w:w="150" w:type="dxa"/>
+              <w:right w:w="150" w:type="dxa"/>
+            </w:tcMar>
+            <w:shd w:fill="F8FAFC"/>
+          </w:tcPr>
+          <w:p>
+            <w:r>
+              <w:rPr>
+                <w:color w:val="1E293B"/>
+                <w:sz w:val="19"/>
+              </w:rPr>
+              <w:t>16 Cycles</w:t>
+            </w:r>
+          </w:p>
+        </w:tc>
+        <w:tc>
+          <w:tcPr>
+            <w:tcW w:type="dxa" w:w="1872"/>
+            <w:vAlign w:val="center"/>
+            <w:tcMar>
+              <w:top w:w="120" w:type="dxa"/>
+              <w:bottom w:w="120" w:type="dxa"/>
+              <w:left w:w="150" w:type="dxa"/>
+              <w:right w:w="150" w:type="dxa"/>
+            </w:tcMar>
+            <w:shd w:fill="F8FAFC"/>
+          </w:tcPr>
+          <w:p>
+            <w:r>
+              <w:rPr>
+                <w:color w:val="1E293B"/>
+                <w:sz w:val="19"/>
+              </w:rPr>
+              <w:t>50% (Alternating Interleave)</w:t>
+            </w:r>
+          </w:p>
+        </w:tc>
+      </w:tr>
+      <w:tr>
+        <w:tc>
+          <w:tcPr>
+            <w:tcW w:type="dxa" w:w="1872"/>
+            <w:vAlign w:val="center"/>
+            <w:tcMar>
+              <w:top w:w="120" w:type="dxa"/>
+              <w:bottom w:w="120" w:type="dxa"/>
+              <w:left w:w="150" w:type="dxa"/>
+              <w:right w:w="150" w:type="dxa"/>
+            </w:tcMar>
+            <w:shd w:fill="FFFFFF"/>
+          </w:tcPr>
+          <w:p>
+            <w:r>
+              <w:rPr>
+                <w:color w:val="1E293B"/>
+                <w:sz w:val="19"/>
+              </w:rPr>
+              <w:t>Transparent Mode</w:t>
+            </w:r>
+          </w:p>
+        </w:tc>
+        <w:tc>
+          <w:tcPr>
+            <w:tcW w:type="dxa" w:w="1872"/>
+            <w:vAlign w:val="center"/>
+            <w:tcMar>
+              <w:top w:w="120" w:type="dxa"/>
+              <w:bottom w:w="120" w:type="dxa"/>
+              <w:left w:w="150" w:type="dxa"/>
+              <w:right w:w="150" w:type="dxa"/>
+            </w:tcMar>
+            <w:shd w:fill="FFFFFF"/>
+          </w:tcPr>
+          <w:p>
+            <w:r>
+              <w:rPr>
+                <w:color w:val="1E293B"/>
+                <w:sz w:val="19"/>
+              </w:rPr>
+              <w:t>16 Bytes</w:t>
+            </w:r>
+          </w:p>
+        </w:tc>
+        <w:tc>
+          <w:tcPr>
+            <w:tcW w:type="dxa" w:w="1872"/>
+            <w:vAlign w:val="center"/>
+            <w:tcMar>
+              <w:top w:w="120" w:type="dxa"/>
+              <w:bottom w:w="120" w:type="dxa"/>
+              <w:left w:w="150" w:type="dxa"/>
+              <w:right w:w="150" w:type="dxa"/>
+            </w:tcMar>
+            <w:shd w:fill="FFFFFF"/>
+          </w:tcPr>
+          <w:p>
+            <w:r>
+              <w:rPr>
+                <w:color w:val="1E293B"/>
+                <w:sz w:val="19"/>
+              </w:rPr>
+              <w:t>16 Cycles</w:t>
+            </w:r>
+          </w:p>
+        </w:tc>
+        <w:tc>
+          <w:tcPr>
+            <w:tcW w:type="dxa" w:w="1872"/>
+            <w:vAlign w:val="center"/>
+            <w:tcMar>
+              <w:top w:w="120" w:type="dxa"/>
+              <w:bottom w:w="120" w:type="dxa"/>
+              <w:left w:w="150" w:type="dxa"/>
+              <w:right w:w="150" w:type="dxa"/>
+            </w:tcMar>
+            <w:shd w:fill="FFFFFF"/>
+          </w:tcPr>
+          <w:p>
+            <w:r>
+              <w:rPr>
+                <w:color w:val="1E293B"/>
+                <w:sz w:val="19"/>
+              </w:rPr>
+              <w:t>0 Cycles</w:t>
+            </w:r>
+          </w:p>
+        </w:tc>
+        <w:tc>
+          <w:tcPr>
+            <w:tcW w:type="dxa" w:w="1872"/>
+            <w:vAlign w:val="center"/>
+            <w:tcMar>
+              <w:top w:w="120" w:type="dxa"/>
+              <w:bottom w:w="120" w:type="dxa"/>
+              <w:left w:w="150" w:type="dxa"/>
+              <w:right w:w="150" w:type="dxa"/>
+            </w:tcMar>
+            <w:shd w:fill="FFFFFF"/>
+          </w:tcPr>
+          <w:p>
+            <w:r>
+              <w:rPr>
+                <w:color w:val="1E293B"/>
+                <w:sz w:val="19"/>
+              </w:rPr>
+              <w:t>100% (Zero Wait States)</w:t>
             </w:r>
           </w:p>
         </w:tc>
@@ -1498,1008 +1873,71 @@
     </w:tbl>
     <w:p>
       <w:pPr>
-        <w:spacing w:after="80"/>
+        <w:pStyle w:val="Heading2"/>
       </w:pPr>
+      <w:r>
+        <w:t>Test Case 2: Multicore vs. Multiprocessor Execution Race</w:t>
+      </w:r>
     </w:p>
     <w:p>
-      <w:pPr>
-        <w:keepNext/>
-        <w:spacing w:before="240" w:after="80"/>
-      </w:pPr>
       <w:r>
-        <w:rPr>
-          <w:rFonts w:ascii="Calibri" w:hAnsi="Calibri"/>
-          <w:b/>
-          <w:color w:val="2563EB"/>
-          <w:sz w:val="22"/>
-        </w:rPr>
-        <w:t>3.2 Quantitative Comparative Model of the Three DMA Modes (Slide 15)</w:t>
-      </w:r>
-    </w:p>
-    <w:tbl>
-      <w:tblPr>
-        <w:tblW w:type="auto" w:w="0"/>
-        <w:jc w:val="center"/>
-        <w:tblLook w:firstColumn="1" w:firstRow="1" w:lastColumn="0" w:lastRow="0" w:noHBand="0" w:noVBand="1" w:val="04A0"/>
-        <w:tblBorders>
-          <w:top w:val="single" w:sz="4" w:space="0" w:color="1E293B"/>
-          <w:left w:val="single" w:sz="4" w:space="0" w:color="1E293B"/>
-          <w:bottom w:val="single" w:sz="4" w:space="0" w:color="1E293B"/>
-          <w:right w:val="single" w:sz="4" w:space="0" w:color="1E293B"/>
-          <w:insideH w:val="single" w:sz="4" w:space="0" w:color="1E293B"/>
-          <w:insideV w:val="single" w:sz="4" w:space="0" w:color="1E293B"/>
-        </w:tblBorders>
-      </w:tblPr>
-      <w:tblGrid>
-        <w:gridCol w:w="9936"/>
-      </w:tblGrid>
-      <w:tr>
-        <w:tc>
-          <w:tcPr>
-            <w:tcW w:type="dxa" w:w="9792"/>
-            <w:shd w:fill="0F172A"/>
-            <w:tcMar>
-              <w:top w:w="80" w:type="dxa"/>
-              <w:bottom w:w="80" w:type="dxa"/>
-              <w:left w:w="120" w:type="dxa"/>
-              <w:right w:w="120" w:type="dxa"/>
-            </w:tcMar>
-          </w:tcPr>
-          <w:p>
-            <w:pPr>
-              <w:spacing w:after="0"/>
-            </w:pPr>
-            <w:r>
-              <w:rPr>
-                <w:rFonts w:ascii="Consolas" w:hAnsi="Consolas"/>
-                <w:color w:val="F8FAFC"/>
-                <w:sz w:val="17"/>
-              </w:rPr>
-              <w:t>+-----------------------------------------------------------------------------------+</w:t>
-              <w:br/>
-              <w:t>| 1. BURST MODE: Holds bus for entire transfer (T_stall = N * T_bus). 100% CPU lock.|</w:t>
-              <w:br/>
-              <w:t>| 2. CYCLE STEALING: Steals 1 bus cycle per byte, alternates with CPU. No starvation.|</w:t>
-              <w:br/>
-              <w:t>| 3. TRANSPARENT MODE: Steals bus ONLY during CPU internal ALU decode. Zero stall.  |</w:t>
-              <w:br/>
-              <w:t>+-----------------------------------------------------------------------------------+</w:t>
-            </w:r>
-          </w:p>
-        </w:tc>
-      </w:tr>
-    </w:tbl>
-    <w:p>
-      <w:pPr>
-        <w:spacing w:after="80"/>
-      </w:pPr>
-    </w:p>
-    <w:p>
-      <w:pPr>
-        <w:keepNext/>
-        <w:spacing w:before="240" w:after="80"/>
-      </w:pPr>
-      <w:r>
-        <w:rPr>
-          <w:rFonts w:ascii="Calibri" w:hAnsi="Calibri"/>
-          <w:b/>
-          <w:color w:val="2563EB"/>
-          <w:sz w:val="22"/>
-        </w:rPr>
-        <w:t>3.3 Multicore vs. Multiprocessor Latency &amp; Reliability Model (Slides 16–20)</w:t>
+        <w:t>• Single Multi-Threaded Program (Raytracing/Rendering): Multicore finished 2.2x faster (1.1s vs. 2.4s) due to on-chip L3 cache sharing.</w:t>
+        <w:br/>
+        <w:t>• Multiple Independent Server Jobs (Web + DB Server): Multiprocessors achieved superior sustained throughput because physical socket isolation eliminated inter-thread cache thrashing.</w:t>
       </w:r>
     </w:p>
     <w:p>
       <w:pPr>
-        <w:spacing w:after="120" w:line="276" w:lineRule="auto"/>
+        <w:pStyle w:val="Heading2"/>
       </w:pPr>
       <w:r>
-        <w:rPr>
-          <w:rFonts w:ascii="Calibri" w:hAnsi="Calibri"/>
-          <w:color w:val="1E293B"/>
-          <w:sz w:val="19"/>
-        </w:rPr>
-        <w:t>Memory Access Latency Formulation:</w:t>
+        <w:t>Test Case 3: Fault Injection Analysis</w:t>
+      </w:r>
+    </w:p>
+    <w:p>
+      <w:r>
+        <w:t>• Die Overheat (105°C): Triggering die overheat halted all cores simultaneously, verifying that Multicore packaging has a shared silicon single point of failure.</w:t>
         <w:br/>
-        <w:t>• Multicore (On-chip L3 Cache): T_access = T_L1/L2 + P_miss × T_on-chip_L3 ≈ 0.8 ns to 2.2 ns</w:t>
-        <w:br/>
-        <w:t>• Multiprocessor (Motherboard Bus): T_access = T_L1/L2 + P_miss × (T_egress + T_arbitration + T_trace + T_ctrl) ≈ 15 ns to 65 ns</w:t>
-        <w:br/>
-        <w:t>The mathematical inequality (0.8 ns ≪ 25 ns) proves Slide 20: 'Multicore is faster in executing a single program'.</w:t>
-        <w:br/>
-        <w:br/>
-        <w:t>Reliability Formulation:</w:t>
-        <w:br/>
-        <w:t>• Multicore: P(Failure) = p (single-die point of failure).</w:t>
-        <w:br/>
-        <w:t>• Multiprocessor: P(Complete Failure) = p^k (Socket 2 failure leaves Socket 1 operating, proving Slide 19: 'High fault tolerance').</w:t>
+        <w:t>• Socket 2 Disconnection: Pulling Socket 2 allowed Socket 1 to immediately absorb the remaining process, maintaining 100% uptime with graceful degradation.</w:t>
       </w:r>
     </w:p>
     <w:p>
       <w:pPr>
-        <w:keepNext/>
-        <w:spacing w:before="320" w:after="120"/>
+        <w:pStyle w:val="Heading1"/>
       </w:pPr>
       <w:r>
-        <w:rPr>
-          <w:rFonts w:ascii="Calibri" w:hAnsi="Calibri"/>
-          <w:b/>
-          <w:color w:val="0F172A"/>
-          <w:sz w:val="27"/>
-        </w:rPr>
-        <w:t>4. Verification Test Cases &amp; Experimental Results</w:t>
-      </w:r>
-    </w:p>
-    <w:tbl>
-      <w:tblPr>
-        <w:tblW w:type="auto" w:w="0"/>
-        <w:jc w:val="center"/>
-        <w:tblLook w:firstColumn="1" w:firstRow="1" w:lastColumn="0" w:lastRow="0" w:noHBand="0" w:noVBand="1" w:val="04A0"/>
-        <w:tblBorders>
-          <w:top w:val="single" w:sz="4" w:space="0" w:color="CBD5E1"/>
-          <w:left w:val="single" w:sz="4" w:space="0" w:color="CBD5E1"/>
-          <w:bottom w:val="single" w:sz="4" w:space="0" w:color="CBD5E1"/>
-          <w:right w:val="single" w:sz="4" w:space="0" w:color="CBD5E1"/>
-          <w:insideH w:val="single" w:sz="4" w:space="0" w:color="CBD5E1"/>
-          <w:insideV w:val="single" w:sz="4" w:space="0" w:color="CBD5E1"/>
-        </w:tblBorders>
-      </w:tblPr>
-      <w:tblGrid>
-        <w:gridCol w:w="1656"/>
-        <w:gridCol w:w="1656"/>
-        <w:gridCol w:w="1656"/>
-        <w:gridCol w:w="1656"/>
-        <w:gridCol w:w="1656"/>
-        <w:gridCol w:w="1656"/>
-      </w:tblGrid>
-      <w:tr>
-        <w:tc>
-          <w:tcPr>
-            <w:tcW w:type="dxa" w:w="1728"/>
-            <w:shd w:fill="1E293B"/>
-            <w:tcMar>
-              <w:top w:w="70" w:type="dxa"/>
-              <w:bottom w:w="70" w:type="dxa"/>
-              <w:left w:w="70" w:type="dxa"/>
-              <w:right w:w="70" w:type="dxa"/>
-            </w:tcMar>
-          </w:tcPr>
-          <w:p>
-            <w:pPr>
-              <w:spacing w:after="0"/>
-            </w:pPr>
-            <w:r>
-              <w:rPr>
-                <w:rFonts w:ascii="Calibri" w:hAnsi="Calibri"/>
-                <w:b/>
-                <w:color w:val="FFFFFF"/>
-                <w:sz w:val="16"/>
-              </w:rPr>
-              <w:t>DMA Mode</w:t>
-            </w:r>
-          </w:p>
-        </w:tc>
-        <w:tc>
-          <w:tcPr>
-            <w:tcW w:type="dxa" w:w="1296"/>
-            <w:shd w:fill="1E293B"/>
-            <w:tcMar>
-              <w:top w:w="70" w:type="dxa"/>
-              <w:bottom w:w="70" w:type="dxa"/>
-              <w:left w:w="70" w:type="dxa"/>
-              <w:right w:w="70" w:type="dxa"/>
-            </w:tcMar>
-          </w:tcPr>
-          <w:p>
-            <w:pPr>
-              <w:spacing w:after="0"/>
-            </w:pPr>
-            <w:r>
-              <w:rPr>
-                <w:rFonts w:ascii="Calibri" w:hAnsi="Calibri"/>
-                <w:b/>
-                <w:color w:val="FFFFFF"/>
-                <w:sz w:val="16"/>
-              </w:rPr>
-              <w:t>Total Clocks</w:t>
-            </w:r>
-          </w:p>
-        </w:tc>
-        <w:tc>
-          <w:tcPr>
-            <w:tcW w:type="dxa" w:w="1152"/>
-            <w:shd w:fill="1E293B"/>
-            <w:tcMar>
-              <w:top w:w="70" w:type="dxa"/>
-              <w:bottom w:w="70" w:type="dxa"/>
-              <w:left w:w="70" w:type="dxa"/>
-              <w:right w:w="70" w:type="dxa"/>
-            </w:tcMar>
-          </w:tcPr>
-          <w:p>
-            <w:pPr>
-              <w:spacing w:after="0"/>
-            </w:pPr>
-            <w:r>
-              <w:rPr>
-                <w:rFonts w:ascii="Calibri" w:hAnsi="Calibri"/>
-                <w:b/>
-                <w:color w:val="FFFFFF"/>
-                <w:sz w:val="16"/>
-              </w:rPr>
-              <w:t>CPU Work</w:t>
-            </w:r>
-          </w:p>
-        </w:tc>
-        <w:tc>
-          <w:tcPr>
-            <w:tcW w:type="dxa" w:w="1296"/>
-            <w:shd w:fill="1E293B"/>
-            <w:tcMar>
-              <w:top w:w="70" w:type="dxa"/>
-              <w:bottom w:w="70" w:type="dxa"/>
-              <w:left w:w="70" w:type="dxa"/>
-              <w:right w:w="70" w:type="dxa"/>
-            </w:tcMar>
-          </w:tcPr>
-          <w:p>
-            <w:pPr>
-              <w:spacing w:after="0"/>
-            </w:pPr>
-            <w:r>
-              <w:rPr>
-                <w:rFonts w:ascii="Calibri" w:hAnsi="Calibri"/>
-                <w:b/>
-                <w:color w:val="FFFFFF"/>
-                <w:sz w:val="16"/>
-              </w:rPr>
-              <w:t>CPU Stalled</w:t>
-            </w:r>
-          </w:p>
-        </w:tc>
-        <w:tc>
-          <w:tcPr>
-            <w:tcW w:type="dxa" w:w="1584"/>
-            <w:shd w:fill="1E293B"/>
-            <w:tcMar>
-              <w:top w:w="70" w:type="dxa"/>
-              <w:bottom w:w="70" w:type="dxa"/>
-              <w:left w:w="70" w:type="dxa"/>
-              <w:right w:w="70" w:type="dxa"/>
-            </w:tcMar>
-          </w:tcPr>
-          <w:p>
-            <w:pPr>
-              <w:spacing w:after="0"/>
-            </w:pPr>
-            <w:r>
-              <w:rPr>
-                <w:rFonts w:ascii="Calibri" w:hAnsi="Calibri"/>
-                <w:b/>
-                <w:color w:val="FFFFFF"/>
-                <w:sz w:val="16"/>
-              </w:rPr>
-              <w:t>CPU Utilization</w:t>
-            </w:r>
-          </w:p>
-        </w:tc>
-        <w:tc>
-          <w:tcPr>
-            <w:tcW w:type="dxa" w:w="2736"/>
-            <w:shd w:fill="1E293B"/>
-            <w:tcMar>
-              <w:top w:w="70" w:type="dxa"/>
-              <w:bottom w:w="70" w:type="dxa"/>
-              <w:left w:w="70" w:type="dxa"/>
-              <w:right w:w="70" w:type="dxa"/>
-            </w:tcMar>
-          </w:tcPr>
-          <w:p>
-            <w:pPr>
-              <w:spacing w:after="0"/>
-            </w:pPr>
-            <w:r>
-              <w:rPr>
-                <w:rFonts w:ascii="Calibri" w:hAnsi="Calibri"/>
-                <w:b/>
-                <w:color w:val="FFFFFF"/>
-                <w:sz w:val="16"/>
-              </w:rPr>
-              <w:t>Observed Bus Behavior</w:t>
-            </w:r>
-          </w:p>
-        </w:tc>
-      </w:tr>
-      <w:tr>
-        <w:tc>
-          <w:tcPr>
-            <w:tcW w:type="dxa" w:w="1728"/>
-            <w:shd w:fill="F8FAFC"/>
-            <w:tcMar>
-              <w:top w:w="60" w:type="dxa"/>
-              <w:bottom w:w="60" w:type="dxa"/>
-              <w:left w:w="70" w:type="dxa"/>
-              <w:right w:w="70" w:type="dxa"/>
-            </w:tcMar>
-          </w:tcPr>
-          <w:p>
-            <w:pPr>
-              <w:spacing w:after="0"/>
-            </w:pPr>
-            <w:r>
-              <w:rPr>
-                <w:rFonts w:ascii="Calibri" w:hAnsi="Calibri"/>
-                <w:b/>
-                <w:sz w:val="16"/>
-              </w:rPr>
-              <w:t>Burst Mode</w:t>
-            </w:r>
-          </w:p>
-        </w:tc>
-        <w:tc>
-          <w:tcPr>
-            <w:tcW w:type="dxa" w:w="1296"/>
-            <w:shd w:fill="F8FAFC"/>
-            <w:tcMar>
-              <w:top w:w="60" w:type="dxa"/>
-              <w:bottom w:w="60" w:type="dxa"/>
-              <w:left w:w="70" w:type="dxa"/>
-              <w:right w:w="70" w:type="dxa"/>
-            </w:tcMar>
-          </w:tcPr>
-          <w:p>
-            <w:pPr>
-              <w:spacing w:after="0"/>
-            </w:pPr>
-            <w:r>
-              <w:rPr>
-                <w:rFonts w:ascii="Calibri" w:hAnsi="Calibri"/>
-                <w:sz w:val="16"/>
-              </w:rPr>
-              <w:t>16</w:t>
-            </w:r>
-          </w:p>
-        </w:tc>
-        <w:tc>
-          <w:tcPr>
-            <w:tcW w:type="dxa" w:w="1152"/>
-            <w:shd w:fill="F8FAFC"/>
-            <w:tcMar>
-              <w:top w:w="60" w:type="dxa"/>
-              <w:bottom w:w="60" w:type="dxa"/>
-              <w:left w:w="70" w:type="dxa"/>
-              <w:right w:w="70" w:type="dxa"/>
-            </w:tcMar>
-          </w:tcPr>
-          <w:p>
-            <w:pPr>
-              <w:spacing w:after="0"/>
-            </w:pPr>
-            <w:r>
-              <w:rPr>
-                <w:rFonts w:ascii="Calibri" w:hAnsi="Calibri"/>
-                <w:sz w:val="16"/>
-              </w:rPr>
-              <w:t>0</w:t>
-            </w:r>
-          </w:p>
-        </w:tc>
-        <w:tc>
-          <w:tcPr>
-            <w:tcW w:type="dxa" w:w="1296"/>
-            <w:shd w:fill="F8FAFC"/>
-            <w:tcMar>
-              <w:top w:w="60" w:type="dxa"/>
-              <w:bottom w:w="60" w:type="dxa"/>
-              <w:left w:w="70" w:type="dxa"/>
-              <w:right w:w="70" w:type="dxa"/>
-            </w:tcMar>
-          </w:tcPr>
-          <w:p>
-            <w:pPr>
-              <w:spacing w:after="0"/>
-            </w:pPr>
-            <w:r>
-              <w:rPr>
-                <w:rFonts w:ascii="Calibri" w:hAnsi="Calibri"/>
-                <w:sz w:val="16"/>
-              </w:rPr>
-              <w:t>16</w:t>
-            </w:r>
-          </w:p>
-        </w:tc>
-        <w:tc>
-          <w:tcPr>
-            <w:tcW w:type="dxa" w:w="1584"/>
-            <w:shd w:fill="F8FAFC"/>
-            <w:tcMar>
-              <w:top w:w="60" w:type="dxa"/>
-              <w:bottom w:w="60" w:type="dxa"/>
-              <w:left w:w="70" w:type="dxa"/>
-              <w:right w:w="70" w:type="dxa"/>
-            </w:tcMar>
-          </w:tcPr>
-          <w:p>
-            <w:pPr>
-              <w:spacing w:after="0"/>
-            </w:pPr>
-            <w:r>
-              <w:rPr>
-                <w:rFonts w:ascii="Calibri" w:hAnsi="Calibri"/>
-                <w:b/>
-                <w:sz w:val="16"/>
-              </w:rPr>
-              <w:t>0%</w:t>
-            </w:r>
-          </w:p>
-        </w:tc>
-        <w:tc>
-          <w:tcPr>
-            <w:tcW w:type="dxa" w:w="2736"/>
-            <w:shd w:fill="F8FAFC"/>
-            <w:tcMar>
-              <w:top w:w="60" w:type="dxa"/>
-              <w:bottom w:w="60" w:type="dxa"/>
-              <w:left w:w="70" w:type="dxa"/>
-              <w:right w:w="70" w:type="dxa"/>
-            </w:tcMar>
-          </w:tcPr>
-          <w:p>
-            <w:pPr>
-              <w:spacing w:after="0"/>
-            </w:pPr>
-            <w:r>
-              <w:rPr>
-                <w:rFonts w:ascii="Calibri" w:hAnsi="Calibri"/>
-                <w:sz w:val="16"/>
-              </w:rPr>
-              <w:t>Full bus lock; CPU in red STALLED state throughout transfer.</w:t>
-            </w:r>
-          </w:p>
-        </w:tc>
-      </w:tr>
-      <w:tr>
-        <w:tc>
-          <w:tcPr>
-            <w:tcW w:type="dxa" w:w="1728"/>
-            <w:shd w:fill="FFFFFF"/>
-            <w:tcMar>
-              <w:top w:w="60" w:type="dxa"/>
-              <w:bottom w:w="60" w:type="dxa"/>
-              <w:left w:w="70" w:type="dxa"/>
-              <w:right w:w="70" w:type="dxa"/>
-            </w:tcMar>
-          </w:tcPr>
-          <w:p>
-            <w:pPr>
-              <w:spacing w:after="0"/>
-            </w:pPr>
-            <w:r>
-              <w:rPr>
-                <w:rFonts w:ascii="Calibri" w:hAnsi="Calibri"/>
-                <w:b/>
-                <w:sz w:val="16"/>
-              </w:rPr>
-              <w:t>Cycle Stealing</w:t>
-            </w:r>
-          </w:p>
-        </w:tc>
-        <w:tc>
-          <w:tcPr>
-            <w:tcW w:type="dxa" w:w="1296"/>
-            <w:shd w:fill="FFFFFF"/>
-            <w:tcMar>
-              <w:top w:w="60" w:type="dxa"/>
-              <w:bottom w:w="60" w:type="dxa"/>
-              <w:left w:w="70" w:type="dxa"/>
-              <w:right w:w="70" w:type="dxa"/>
-            </w:tcMar>
-          </w:tcPr>
-          <w:p>
-            <w:pPr>
-              <w:spacing w:after="0"/>
-            </w:pPr>
-            <w:r>
-              <w:rPr>
-                <w:rFonts w:ascii="Calibri" w:hAnsi="Calibri"/>
-                <w:sz w:val="16"/>
-              </w:rPr>
-              <w:t>32</w:t>
-            </w:r>
-          </w:p>
-        </w:tc>
-        <w:tc>
-          <w:tcPr>
-            <w:tcW w:type="dxa" w:w="1152"/>
-            <w:shd w:fill="FFFFFF"/>
-            <w:tcMar>
-              <w:top w:w="60" w:type="dxa"/>
-              <w:bottom w:w="60" w:type="dxa"/>
-              <w:left w:w="70" w:type="dxa"/>
-              <w:right w:w="70" w:type="dxa"/>
-            </w:tcMar>
-          </w:tcPr>
-          <w:p>
-            <w:pPr>
-              <w:spacing w:after="0"/>
-            </w:pPr>
-            <w:r>
-              <w:rPr>
-                <w:rFonts w:ascii="Calibri" w:hAnsi="Calibri"/>
-                <w:sz w:val="16"/>
-              </w:rPr>
-              <w:t>16</w:t>
-            </w:r>
-          </w:p>
-        </w:tc>
-        <w:tc>
-          <w:tcPr>
-            <w:tcW w:type="dxa" w:w="1296"/>
-            <w:shd w:fill="FFFFFF"/>
-            <w:tcMar>
-              <w:top w:w="60" w:type="dxa"/>
-              <w:bottom w:w="60" w:type="dxa"/>
-              <w:left w:w="70" w:type="dxa"/>
-              <w:right w:w="70" w:type="dxa"/>
-            </w:tcMar>
-          </w:tcPr>
-          <w:p>
-            <w:pPr>
-              <w:spacing w:after="0"/>
-            </w:pPr>
-            <w:r>
-              <w:rPr>
-                <w:rFonts w:ascii="Calibri" w:hAnsi="Calibri"/>
-                <w:sz w:val="16"/>
-              </w:rPr>
-              <w:t>16</w:t>
-            </w:r>
-          </w:p>
-        </w:tc>
-        <w:tc>
-          <w:tcPr>
-            <w:tcW w:type="dxa" w:w="1584"/>
-            <w:shd w:fill="FFFFFF"/>
-            <w:tcMar>
-              <w:top w:w="60" w:type="dxa"/>
-              <w:bottom w:w="60" w:type="dxa"/>
-              <w:left w:w="70" w:type="dxa"/>
-              <w:right w:w="70" w:type="dxa"/>
-            </w:tcMar>
-          </w:tcPr>
-          <w:p>
-            <w:pPr>
-              <w:spacing w:after="0"/>
-            </w:pPr>
-            <w:r>
-              <w:rPr>
-                <w:rFonts w:ascii="Calibri" w:hAnsi="Calibri"/>
-                <w:b/>
-                <w:sz w:val="16"/>
-              </w:rPr>
-              <w:t>50%</w:t>
-            </w:r>
-          </w:p>
-        </w:tc>
-        <w:tc>
-          <w:tcPr>
-            <w:tcW w:type="dxa" w:w="2736"/>
-            <w:shd w:fill="FFFFFF"/>
-            <w:tcMar>
-              <w:top w:w="60" w:type="dxa"/>
-              <w:bottom w:w="60" w:type="dxa"/>
-              <w:left w:w="70" w:type="dxa"/>
-              <w:right w:w="70" w:type="dxa"/>
-            </w:tcMar>
-          </w:tcPr>
-          <w:p>
-            <w:pPr>
-              <w:spacing w:after="0"/>
-            </w:pPr>
-            <w:r>
-              <w:rPr>
-                <w:rFonts w:ascii="Calibri" w:hAnsi="Calibri"/>
-                <w:sz w:val="16"/>
-              </w:rPr>
-              <w:t>Alternating green/red slots on Gantt oscilloscope; no starvation.</w:t>
-            </w:r>
-          </w:p>
-        </w:tc>
-      </w:tr>
-      <w:tr>
-        <w:tc>
-          <w:tcPr>
-            <w:tcW w:type="dxa" w:w="1728"/>
-            <w:shd w:fill="F8FAFC"/>
-            <w:tcMar>
-              <w:top w:w="60" w:type="dxa"/>
-              <w:bottom w:w="60" w:type="dxa"/>
-              <w:left w:w="70" w:type="dxa"/>
-              <w:right w:w="70" w:type="dxa"/>
-            </w:tcMar>
-          </w:tcPr>
-          <w:p>
-            <w:pPr>
-              <w:spacing w:after="0"/>
-            </w:pPr>
-            <w:r>
-              <w:rPr>
-                <w:rFonts w:ascii="Calibri" w:hAnsi="Calibri"/>
-                <w:b/>
-                <w:sz w:val="16"/>
-              </w:rPr>
-              <w:t>Transparent</w:t>
-            </w:r>
-          </w:p>
-        </w:tc>
-        <w:tc>
-          <w:tcPr>
-            <w:tcW w:type="dxa" w:w="1296"/>
-            <w:shd w:fill="F8FAFC"/>
-            <w:tcMar>
-              <w:top w:w="60" w:type="dxa"/>
-              <w:bottom w:w="60" w:type="dxa"/>
-              <w:left w:w="70" w:type="dxa"/>
-              <w:right w:w="70" w:type="dxa"/>
-            </w:tcMar>
-          </w:tcPr>
-          <w:p>
-            <w:pPr>
-              <w:spacing w:after="0"/>
-            </w:pPr>
-            <w:r>
-              <w:rPr>
-                <w:rFonts w:ascii="Calibri" w:hAnsi="Calibri"/>
-                <w:sz w:val="16"/>
-              </w:rPr>
-              <w:t>16</w:t>
-            </w:r>
-          </w:p>
-        </w:tc>
-        <w:tc>
-          <w:tcPr>
-            <w:tcW w:type="dxa" w:w="1152"/>
-            <w:shd w:fill="F8FAFC"/>
-            <w:tcMar>
-              <w:top w:w="60" w:type="dxa"/>
-              <w:bottom w:w="60" w:type="dxa"/>
-              <w:left w:w="70" w:type="dxa"/>
-              <w:right w:w="70" w:type="dxa"/>
-            </w:tcMar>
-          </w:tcPr>
-          <w:p>
-            <w:pPr>
-              <w:spacing w:after="0"/>
-            </w:pPr>
-            <w:r>
-              <w:rPr>
-                <w:rFonts w:ascii="Calibri" w:hAnsi="Calibri"/>
-                <w:sz w:val="16"/>
-              </w:rPr>
-              <w:t>16</w:t>
-            </w:r>
-          </w:p>
-        </w:tc>
-        <w:tc>
-          <w:tcPr>
-            <w:tcW w:type="dxa" w:w="1296"/>
-            <w:shd w:fill="F8FAFC"/>
-            <w:tcMar>
-              <w:top w:w="60" w:type="dxa"/>
-              <w:bottom w:w="60" w:type="dxa"/>
-              <w:left w:w="70" w:type="dxa"/>
-              <w:right w:w="70" w:type="dxa"/>
-            </w:tcMar>
-          </w:tcPr>
-          <w:p>
-            <w:pPr>
-              <w:spacing w:after="0"/>
-            </w:pPr>
-            <w:r>
-              <w:rPr>
-                <w:rFonts w:ascii="Calibri" w:hAnsi="Calibri"/>
-                <w:sz w:val="16"/>
-              </w:rPr>
-              <w:t>0</w:t>
-            </w:r>
-          </w:p>
-        </w:tc>
-        <w:tc>
-          <w:tcPr>
-            <w:tcW w:type="dxa" w:w="1584"/>
-            <w:shd w:fill="F8FAFC"/>
-            <w:tcMar>
-              <w:top w:w="60" w:type="dxa"/>
-              <w:bottom w:w="60" w:type="dxa"/>
-              <w:left w:w="70" w:type="dxa"/>
-              <w:right w:w="70" w:type="dxa"/>
-            </w:tcMar>
-          </w:tcPr>
-          <w:p>
-            <w:pPr>
-              <w:spacing w:after="0"/>
-            </w:pPr>
-            <w:r>
-              <w:rPr>
-                <w:rFonts w:ascii="Calibri" w:hAnsi="Calibri"/>
-                <w:b/>
-                <w:sz w:val="16"/>
-              </w:rPr>
-              <w:t>100%</w:t>
-            </w:r>
-          </w:p>
-        </w:tc>
-        <w:tc>
-          <w:tcPr>
-            <w:tcW w:type="dxa" w:w="2736"/>
-            <w:shd w:fill="F8FAFC"/>
-            <w:tcMar>
-              <w:top w:w="60" w:type="dxa"/>
-              <w:bottom w:w="60" w:type="dxa"/>
-              <w:left w:w="70" w:type="dxa"/>
-              <w:right w:w="70" w:type="dxa"/>
-            </w:tcMar>
-          </w:tcPr>
-          <w:p>
-            <w:pPr>
-              <w:spacing w:after="0"/>
-            </w:pPr>
-            <w:r>
-              <w:rPr>
-                <w:rFonts w:ascii="Calibri" w:hAnsi="Calibri"/>
-                <w:sz w:val="16"/>
-              </w:rPr>
-              <w:t>Zero CPU stalls; DMA sneaks cycles during CPU ALU decode.</w:t>
-            </w:r>
-          </w:p>
-        </w:tc>
-      </w:tr>
-    </w:tbl>
-    <w:p>
-      <w:pPr>
-        <w:spacing w:after="120" w:line="276" w:lineRule="auto"/>
-      </w:pPr>
-      <w:r>
-        <w:rPr>
-          <w:rFonts w:ascii="Calibri" w:hAnsi="Calibri"/>
-          <w:b/>
-          <w:color w:val="0F172A"/>
-          <w:sz w:val="19"/>
-        </w:rPr>
-        <w:t xml:space="preserve">Test Case 2: </w:t>
-      </w:r>
-      <w:r>
-        <w:rPr>
-          <w:rFonts w:ascii="Calibri" w:hAnsi="Calibri"/>
-          <w:color w:val="1E293B"/>
-          <w:sz w:val="19"/>
-        </w:rPr>
-        <w:t>Test Case 2 (Multicore Rendering): Completed in 1.1s (0.8 ns L3 cache) vs 2.4s on Multiprocessor (84% bus contention serialization).</w:t>
+        <w:t>6. Sign-Off &amp; Academic Certification</w:t>
       </w:r>
     </w:p>
     <w:p>
-      <w:pPr>
-        <w:spacing w:after="120" w:line="276" w:lineRule="auto"/>
-      </w:pPr>
       <w:r>
-        <w:rPr>
-          <w:rFonts w:ascii="Calibri" w:hAnsi="Calibri"/>
-          <w:b/>
-          <w:color w:val="0F172A"/>
-          <w:sz w:val="19"/>
-        </w:rPr>
-        <w:t xml:space="preserve">Test Case 3: </w:t>
-      </w:r>
-      <w:r>
-        <w:rPr>
-          <w:rFonts w:ascii="Calibri" w:hAnsi="Calibri"/>
-          <w:color w:val="1E293B"/>
-          <w:sz w:val="19"/>
-        </w:rPr>
-        <w:t>Test Case 3 (Fault Injection): Die Overheat crashed all 4 cores (100% outage), whereas Pull Socket 2 preserved Socket 1 running (0% outage), confirming Slide 19.</w:t>
+        <w:t>Respectfully submitted for academic examination and evaluation in CS3001.</w:t>
+        <w:br/>
+        <w:br/>
+        <w:t>Project Team Members:</w:t>
+        <w:br/>
+        <w:t>• Nikhil (Roll / Registration: Computer Science &amp; Engineering)</w:t>
+        <w:br/>
+        <w:t>• Sakshi (Roll / Registration: Computer Science &amp; Engineering)</w:t>
+        <w:br/>
+        <w:br/>
+        <w:t>Faculty Assessment &amp; Remarks:</w:t>
+        <w:br/>
+        <w:t>Evaluator: Prof. Shivashish Gour</w:t>
+        <w:br/>
+        <w:t>Grade / Marks: _____________________</w:t>
+        <w:br/>
+        <w:t>Signature: __________________________        Date: October 31, 2026</w:t>
       </w:r>
     </w:p>
-    <w:p>
-      <w:pPr>
-        <w:keepNext/>
-        <w:spacing w:before="320" w:after="120"/>
-      </w:pPr>
-      <w:r>
-        <w:rPr>
-          <w:rFonts w:ascii="Calibri" w:hAnsi="Calibri"/>
-          <w:b/>
-          <w:color w:val="0F172A"/>
-          <w:sz w:val="27"/>
-        </w:rPr>
-        <w:t>5. Conclusion &amp; Faculty Sign-Off</w:t>
-      </w:r>
-    </w:p>
-    <w:p>
-      <w:pPr>
-        <w:spacing w:after="120" w:line="276" w:lineRule="auto"/>
-      </w:pPr>
-      <w:r>
-        <w:rPr>
-          <w:rFonts w:ascii="Calibri" w:hAnsi="Calibri"/>
-          <w:color w:val="1E293B"/>
-          <w:sz w:val="19"/>
-        </w:rPr>
-        <w:t>The platform successfully validates the concurrency, DMA, and multicore principles of Module 1. Respectfully submitted for academic evaluation.</w:t>
-      </w:r>
-    </w:p>
-    <w:tbl>
-      <w:tblPr>
-        <w:tblW w:type="auto" w:w="0"/>
-        <w:jc w:val="center"/>
-        <w:tblLook w:firstColumn="1" w:firstRow="1" w:lastColumn="0" w:lastRow="0" w:noHBand="0" w:noVBand="1" w:val="04A0"/>
-        <w:tblBorders>
-          <w:top w:val="single" w:sz="6" w:space="0" w:color="CBD5E1"/>
-          <w:left w:val="single" w:sz="6" w:space="0" w:color="CBD5E1"/>
-          <w:bottom w:val="single" w:sz="6" w:space="0" w:color="CBD5E1"/>
-          <w:right w:val="single" w:sz="6" w:space="0" w:color="CBD5E1"/>
-          <w:insideH w:val="single" w:sz="6" w:space="0" w:color="CBD5E1"/>
-          <w:insideV w:val="single" w:sz="6" w:space="0" w:color="CBD5E1"/>
-        </w:tblBorders>
-      </w:tblPr>
-      <w:tblGrid>
-        <w:gridCol w:w="4968"/>
-        <w:gridCol w:w="4968"/>
-      </w:tblGrid>
-      <w:tr>
-        <w:tc>
-          <w:tcPr>
-            <w:tcW w:type="dxa" w:w="4896"/>
-            <w:shd w:fill="F8FAFC"/>
-            <w:tcMar>
-              <w:top w:w="120" w:type="dxa"/>
-              <w:bottom w:w="120" w:type="dxa"/>
-              <w:left w:w="140" w:type="dxa"/>
-              <w:right w:w="140" w:type="dxa"/>
-            </w:tcMar>
-          </w:tcPr>
-          <w:p>
-            <w:pPr>
-              <w:spacing w:after="60"/>
-            </w:pPr>
-            <w:r>
-              <w:rPr>
-                <w:b/>
-                <w:color w:val="0F172A"/>
-              </w:rPr>
-              <w:t>Faculty Evaluator:</w:t>
-              <w:br/>
-            </w:r>
-            <w:r>
-              <w:rPr>
-                <w:b/>
-                <w:color w:val="2563EB"/>
-                <w:sz w:val="21"/>
-              </w:rPr>
-              <w:t>Prof. Shivashish Gour</w:t>
-              <w:br/>
-            </w:r>
-            <w:r>
-              <w:t>Dept. of Computer Science &amp; Engineering</w:t>
-              <w:br/>
-              <w:br/>
-            </w:r>
-            <w:r>
-              <w:rPr>
-                <w:b/>
-                <w:color w:val="0F172A"/>
-              </w:rPr>
-              <w:t>Grade / Marks Awarded:</w:t>
-              <w:br/>
-              <w:br/>
-            </w:r>
-            <w:r>
-              <w:t>______________________________</w:t>
-            </w:r>
-          </w:p>
-        </w:tc>
-        <w:tc>
-          <w:tcPr>
-            <w:tcW w:type="dxa" w:w="4896"/>
-            <w:shd w:fill="F8FAFC"/>
-            <w:tcMar>
-              <w:top w:w="120" w:type="dxa"/>
-              <w:bottom w:w="120" w:type="dxa"/>
-              <w:left w:w="140" w:type="dxa"/>
-              <w:right w:w="140" w:type="dxa"/>
-            </w:tcMar>
-          </w:tcPr>
-          <w:p>
-            <w:pPr>
-              <w:spacing w:after="60"/>
-            </w:pPr>
-            <w:r>
-              <w:rPr>
-                <w:b/>
-                <w:color w:val="0F172A"/>
-              </w:rPr>
-              <w:t>Evaluation Remarks:</w:t>
-              <w:br/>
-              <w:br/>
-            </w:r>
-            <w:r>
-              <w:t>_________________________________________</w:t>
-              <w:br/>
-              <w:br/>
-            </w:r>
-            <w:r>
-              <w:rPr>
-                <w:b/>
-                <w:color w:val="0F172A"/>
-              </w:rPr>
-              <w:t xml:space="preserve">Faculty Signature: </w:t>
-            </w:r>
-            <w:r>
-              <w:t>_____________________</w:t>
-              <w:br/>
-              <w:br/>
-            </w:r>
-            <w:r>
-              <w:rPr>
-                <w:b/>
-                <w:color w:val="0F172A"/>
-              </w:rPr>
-              <w:t xml:space="preserve">Date: </w:t>
-            </w:r>
-            <w:r>
-              <w:t>_____________________________</w:t>
-            </w:r>
-          </w:p>
-        </w:tc>
-      </w:tr>
-    </w:tbl>
     <w:sectPr>
-      <w:headerReference w:type="default" r:id="rId9"/>
-      <w:footerReference w:type="default" r:id="rId10"/>
       <w:pgSz w:w="12240" w:h="15840"/>
-      <w:pgMar w:top="1152" w:right="1152" w:bottom="1152" w:left="1152" w:header="720" w:footer="720" w:gutter="0"/>
+      <w:pgMar w:top="1440" w:right="1440" w:bottom="1440" w:left="1440" w:header="720" w:footer="720" w:gutter="0"/>
       <w:cols w:space="720"/>
       <w:docGrid w:linePitch="360"/>
     </w:sectPr>
   </w:body>
 </w:document>
-</file>
-
-<file path=word/footer1.xml><?xml version="1.0" encoding="utf-8"?>
-<w:ftr xmlns:m="http://schemas.openxmlformats.org/officeDocument/2006/math" xmlns:mc="http://schemas.openxmlformats.org/markup-compatibility/2006" xmlns:mo="http://schemas.microsoft.com/office/mac/office/2008/main" xmlns:mv="urn:schemas-microsoft-com:mac:vml" xmlns:o="urn:schemas-microsoft-com:office:office" xmlns:r="http://schemas.openxmlformats.org/officeDocument/2006/relationships" xmlns:v="urn:schemas-microsoft-com:vml" xmlns:w10="urn:schemas-microsoft-com:office:word" xmlns:w14="http://schemas.microsoft.com/office/word/2010/wordml" xmlns:w="http://schemas.openxmlformats.org/wordprocessingml/2006/main" xmlns:wne="http://schemas.microsoft.com/office/word/2006/wordml" xmlns:wp14="http://schemas.microsoft.com/office/word/2010/wordprocessingDrawing" xmlns:wp="http://schemas.openxmlformats.org/drawingml/2006/wordprocessingDrawing" xmlns:wpc="http://schemas.microsoft.com/office/word/2010/wordprocessingCanvas" xmlns:wpg="http://schemas.microsoft.com/office/word/2010/wordprocessingGroup" xmlns:wpi="http://schemas.microsoft.com/office/word/2010/wordprocessingInk" xmlns:wps="http://schemas.microsoft.com/office/word/2010/wordprocessingShape" mc:Ignorable="w14 wp14">
-  <w:p>
-    <w:pPr>
-      <w:pStyle w:val="Footer"/>
-      <w:jc w:val="center"/>
-    </w:pPr>
-    <w:r>
-      <w:rPr>
-        <w:rFonts w:ascii="Calibri" w:hAnsi="Calibri"/>
-        <w:color w:val="94A3B8"/>
-        <w:sz w:val="17"/>
-      </w:rPr>
-      <w:t>Submitted to Prof. Shivashish Gour  •  Department of Computer Science &amp; Engineering</w:t>
-    </w:r>
-  </w:p>
-</w:ftr>
-</file>
-
-<file path=word/header1.xml><?xml version="1.0" encoding="utf-8"?>
-<w:hdr xmlns:m="http://schemas.openxmlformats.org/officeDocument/2006/math" xmlns:mc="http://schemas.openxmlformats.org/markup-compatibility/2006" xmlns:mo="http://schemas.microsoft.com/office/mac/office/2008/main" xmlns:mv="urn:schemas-microsoft-com:mac:vml" xmlns:o="urn:schemas-microsoft-com:office:office" xmlns:r="http://schemas.openxmlformats.org/officeDocument/2006/relationships" xmlns:v="urn:schemas-microsoft-com:vml" xmlns:w10="urn:schemas-microsoft-com:office:word" xmlns:w14="http://schemas.microsoft.com/office/word/2010/wordml" xmlns:w="http://schemas.openxmlformats.org/wordprocessingml/2006/main" xmlns:wne="http://schemas.microsoft.com/office/word/2006/wordml" xmlns:wp14="http://schemas.microsoft.com/office/word/2010/wordprocessingDrawing" xmlns:wp="http://schemas.openxmlformats.org/drawingml/2006/wordprocessingDrawing" xmlns:wpc="http://schemas.microsoft.com/office/word/2010/wordprocessingCanvas" xmlns:wpg="http://schemas.microsoft.com/office/word/2010/wordprocessingGroup" xmlns:wpi="http://schemas.microsoft.com/office/word/2010/wordprocessingInk" xmlns:wps="http://schemas.microsoft.com/office/word/2010/wordprocessingShape" mc:Ignorable="w14 wp14">
-  <w:p>
-    <w:pPr>
-      <w:pStyle w:val="Header"/>
-      <w:jc w:val="right"/>
-    </w:pPr>
-    <w:r>
-      <w:rPr>
-        <w:rFonts w:ascii="Calibri" w:hAnsi="Calibri"/>
-        <w:color w:val="94A3B8"/>
-        <w:sz w:val="17"/>
-      </w:rPr>
-      <w:t>CS3001 Operating Systems | Academic Project Report</w:t>
-    </w:r>
-  </w:p>
-</w:hdr>
 </file>
 
 <file path=word/numbering.xml><?xml version="1.0" encoding="utf-8"?>

</xml_diff>